<commit_message>
docs: focus UTS report on implemented TravelFit scope
</commit_message>
<xml_diff>
--- a/outputs/uts_travelfit/Laporan_UTS_TravelFit.docx
+++ b/outputs/uts_travelfit/Laporan_UTS_TravelFit.docx
@@ -141,7 +141,7 @@
       <w:r>
         <w:fldChar w:fldCharType="separate"/>
       </w:r>
-      <w:hyperlink w:anchor="_Toc242111072" w:history="1">
+      <w:hyperlink w:anchor="_Toc242114639" w:history="1">
         <w:r>
           <w:rPr>
             <w:rStyle w:val="Hyperlink"/>
@@ -168,7 +168,7 @@
             <w:noProof/>
             <w:webHidden/>
           </w:rPr>
-          <w:instrText xml:space="preserve"> PAGEREF _Toc242111072 \h </w:instrText>
+          <w:instrText xml:space="preserve"> PAGEREF _Toc242114639 \h </w:instrText>
         </w:r>
         <w:r>
           <w:rPr>
@@ -216,7 +216,7 @@
           <w14:ligatures w14:val="standardContextual"/>
         </w:rPr>
       </w:pPr>
-      <w:hyperlink w:anchor="_Toc242111073" w:history="1">
+      <w:hyperlink w:anchor="_Toc242114640" w:history="1">
         <w:r>
           <w:rPr>
             <w:rStyle w:val="Hyperlink"/>
@@ -243,7 +243,7 @@
             <w:noProof/>
             <w:webHidden/>
           </w:rPr>
-          <w:instrText xml:space="preserve"> PAGEREF _Toc242111073 \h </w:instrText>
+          <w:instrText xml:space="preserve"> PAGEREF _Toc242114640 \h </w:instrText>
         </w:r>
         <w:r>
           <w:rPr>
@@ -291,7 +291,7 @@
           <w14:ligatures w14:val="standardContextual"/>
         </w:rPr>
       </w:pPr>
-      <w:hyperlink w:anchor="_Toc242111074" w:history="1">
+      <w:hyperlink w:anchor="_Toc242114641" w:history="1">
         <w:r>
           <w:rPr>
             <w:rStyle w:val="Hyperlink"/>
@@ -318,7 +318,7 @@
             <w:noProof/>
             <w:webHidden/>
           </w:rPr>
-          <w:instrText xml:space="preserve"> PAGEREF _Toc242111074 \h </w:instrText>
+          <w:instrText xml:space="preserve"> PAGEREF _Toc242114641 \h </w:instrText>
         </w:r>
         <w:r>
           <w:rPr>
@@ -366,7 +366,7 @@
           <w14:ligatures w14:val="standardContextual"/>
         </w:rPr>
       </w:pPr>
-      <w:hyperlink w:anchor="_Toc242111075" w:history="1">
+      <w:hyperlink w:anchor="_Toc242114642" w:history="1">
         <w:r>
           <w:rPr>
             <w:rStyle w:val="Hyperlink"/>
@@ -393,7 +393,7 @@
             <w:noProof/>
             <w:webHidden/>
           </w:rPr>
-          <w:instrText xml:space="preserve"> PAGEREF _Toc242111075 \h </w:instrText>
+          <w:instrText xml:space="preserve"> PAGEREF _Toc242114642 \h </w:instrText>
         </w:r>
         <w:r>
           <w:rPr>
@@ -441,7 +441,7 @@
           <w14:ligatures w14:val="standardContextual"/>
         </w:rPr>
       </w:pPr>
-      <w:hyperlink w:anchor="_Toc242111076" w:history="1">
+      <w:hyperlink w:anchor="_Toc242114643" w:history="1">
         <w:r>
           <w:rPr>
             <w:rStyle w:val="Hyperlink"/>
@@ -468,7 +468,7 @@
             <w:noProof/>
             <w:webHidden/>
           </w:rPr>
-          <w:instrText xml:space="preserve"> PAGEREF _Toc242111076 \h </w:instrText>
+          <w:instrText xml:space="preserve"> PAGEREF _Toc242114643 \h </w:instrText>
         </w:r>
         <w:r>
           <w:rPr>
@@ -516,7 +516,7 @@
           <w14:ligatures w14:val="standardContextual"/>
         </w:rPr>
       </w:pPr>
-      <w:hyperlink w:anchor="_Toc242111077" w:history="1">
+      <w:hyperlink w:anchor="_Toc242114644" w:history="1">
         <w:r>
           <w:rPr>
             <w:rStyle w:val="Hyperlink"/>
@@ -543,7 +543,7 @@
             <w:noProof/>
             <w:webHidden/>
           </w:rPr>
-          <w:instrText xml:space="preserve"> PAGEREF _Toc242111077 \h </w:instrText>
+          <w:instrText xml:space="preserve"> PAGEREF _Toc242114644 \h </w:instrText>
         </w:r>
         <w:r>
           <w:rPr>
@@ -591,7 +591,7 @@
           <w14:ligatures w14:val="standardContextual"/>
         </w:rPr>
       </w:pPr>
-      <w:hyperlink w:anchor="_Toc242111078" w:history="1">
+      <w:hyperlink w:anchor="_Toc242114645" w:history="1">
         <w:r>
           <w:rPr>
             <w:rStyle w:val="Hyperlink"/>
@@ -618,7 +618,7 @@
             <w:noProof/>
             <w:webHidden/>
           </w:rPr>
-          <w:instrText xml:space="preserve"> PAGEREF _Toc242111078 \h </w:instrText>
+          <w:instrText xml:space="preserve"> PAGEREF _Toc242114645 \h </w:instrText>
         </w:r>
         <w:r>
           <w:rPr>
@@ -666,7 +666,7 @@
           <w14:ligatures w14:val="standardContextual"/>
         </w:rPr>
       </w:pPr>
-      <w:hyperlink w:anchor="_Toc242111079" w:history="1">
+      <w:hyperlink w:anchor="_Toc242114646" w:history="1">
         <w:r>
           <w:rPr>
             <w:rStyle w:val="Hyperlink"/>
@@ -693,7 +693,7 @@
             <w:noProof/>
             <w:webHidden/>
           </w:rPr>
-          <w:instrText xml:space="preserve"> PAGEREF _Toc242111079 \h </w:instrText>
+          <w:instrText xml:space="preserve"> PAGEREF _Toc242114646 \h </w:instrText>
         </w:r>
         <w:r>
           <w:rPr>
@@ -741,7 +741,7 @@
           <w14:ligatures w14:val="standardContextual"/>
         </w:rPr>
       </w:pPr>
-      <w:hyperlink w:anchor="_Toc242111080" w:history="1">
+      <w:hyperlink w:anchor="_Toc242114647" w:history="1">
         <w:r>
           <w:rPr>
             <w:rStyle w:val="Hyperlink"/>
@@ -768,7 +768,7 @@
             <w:noProof/>
             <w:webHidden/>
           </w:rPr>
-          <w:instrText xml:space="preserve"> PAGEREF _Toc242111080 \h </w:instrText>
+          <w:instrText xml:space="preserve"> PAGEREF _Toc242114647 \h </w:instrText>
         </w:r>
         <w:r>
           <w:rPr>
@@ -816,7 +816,7 @@
           <w14:ligatures w14:val="standardContextual"/>
         </w:rPr>
       </w:pPr>
-      <w:hyperlink w:anchor="_Toc242111081" w:history="1">
+      <w:hyperlink w:anchor="_Toc242114648" w:history="1">
         <w:r>
           <w:rPr>
             <w:rStyle w:val="Hyperlink"/>
@@ -843,7 +843,7 @@
             <w:noProof/>
             <w:webHidden/>
           </w:rPr>
-          <w:instrText xml:space="preserve"> PAGEREF _Toc242111081 \h </w:instrText>
+          <w:instrText xml:space="preserve"> PAGEREF _Toc242114648 \h </w:instrText>
         </w:r>
         <w:r>
           <w:rPr>
@@ -891,7 +891,7 @@
           <w14:ligatures w14:val="standardContextual"/>
         </w:rPr>
       </w:pPr>
-      <w:hyperlink w:anchor="_Toc242111082" w:history="1">
+      <w:hyperlink w:anchor="_Toc242114649" w:history="1">
         <w:r>
           <w:rPr>
             <w:rStyle w:val="Hyperlink"/>
@@ -918,7 +918,7 @@
             <w:noProof/>
             <w:webHidden/>
           </w:rPr>
-          <w:instrText xml:space="preserve"> PAGEREF _Toc242111082 \h </w:instrText>
+          <w:instrText xml:space="preserve"> PAGEREF _Toc242114649 \h </w:instrText>
         </w:r>
         <w:r>
           <w:rPr>
@@ -966,7 +966,7 @@
           <w14:ligatures w14:val="standardContextual"/>
         </w:rPr>
       </w:pPr>
-      <w:hyperlink w:anchor="_Toc242111083" w:history="1">
+      <w:hyperlink w:anchor="_Toc242114650" w:history="1">
         <w:r>
           <w:rPr>
             <w:rStyle w:val="Hyperlink"/>
@@ -993,7 +993,7 @@
             <w:noProof/>
             <w:webHidden/>
           </w:rPr>
-          <w:instrText xml:space="preserve"> PAGEREF _Toc242111083 \h </w:instrText>
+          <w:instrText xml:space="preserve"> PAGEREF _Toc242114650 \h </w:instrText>
         </w:r>
         <w:r>
           <w:rPr>
@@ -1041,7 +1041,7 @@
           <w14:ligatures w14:val="standardContextual"/>
         </w:rPr>
       </w:pPr>
-      <w:hyperlink w:anchor="_Toc242111084" w:history="1">
+      <w:hyperlink w:anchor="_Toc242114651" w:history="1">
         <w:r>
           <w:rPr>
             <w:rStyle w:val="Hyperlink"/>
@@ -1068,7 +1068,7 @@
             <w:noProof/>
             <w:webHidden/>
           </w:rPr>
-          <w:instrText xml:space="preserve"> PAGEREF _Toc242111084 \h </w:instrText>
+          <w:instrText xml:space="preserve"> PAGEREF _Toc242114651 \h </w:instrText>
         </w:r>
         <w:r>
           <w:rPr>
@@ -1116,7 +1116,7 @@
           <w14:ligatures w14:val="standardContextual"/>
         </w:rPr>
       </w:pPr>
-      <w:hyperlink w:anchor="_Toc242111085" w:history="1">
+      <w:hyperlink w:anchor="_Toc242114652" w:history="1">
         <w:r>
           <w:rPr>
             <w:rStyle w:val="Hyperlink"/>
@@ -1143,7 +1143,7 @@
             <w:noProof/>
             <w:webHidden/>
           </w:rPr>
-          <w:instrText xml:space="preserve"> PAGEREF _Toc242111085 \h </w:instrText>
+          <w:instrText xml:space="preserve"> PAGEREF _Toc242114652 \h </w:instrText>
         </w:r>
         <w:r>
           <w:rPr>
@@ -1191,7 +1191,7 @@
           <w14:ligatures w14:val="standardContextual"/>
         </w:rPr>
       </w:pPr>
-      <w:hyperlink w:anchor="_Toc242111086" w:history="1">
+      <w:hyperlink w:anchor="_Toc242114653" w:history="1">
         <w:r>
           <w:rPr>
             <w:rStyle w:val="Hyperlink"/>
@@ -1218,7 +1218,7 @@
             <w:noProof/>
             <w:webHidden/>
           </w:rPr>
-          <w:instrText xml:space="preserve"> PAGEREF _Toc242111086 \h </w:instrText>
+          <w:instrText xml:space="preserve"> PAGEREF _Toc242114653 \h </w:instrText>
         </w:r>
         <w:r>
           <w:rPr>
@@ -1266,7 +1266,7 @@
           <w14:ligatures w14:val="standardContextual"/>
         </w:rPr>
       </w:pPr>
-      <w:hyperlink w:anchor="_Toc242111087" w:history="1">
+      <w:hyperlink w:anchor="_Toc242114654" w:history="1">
         <w:r>
           <w:rPr>
             <w:rStyle w:val="Hyperlink"/>
@@ -1293,7 +1293,7 @@
             <w:noProof/>
             <w:webHidden/>
           </w:rPr>
-          <w:instrText xml:space="preserve"> PAGEREF _Toc242111087 \h </w:instrText>
+          <w:instrText xml:space="preserve"> PAGEREF _Toc242114654 \h </w:instrText>
         </w:r>
         <w:r>
           <w:rPr>
@@ -1341,7 +1341,7 @@
           <w14:ligatures w14:val="standardContextual"/>
         </w:rPr>
       </w:pPr>
-      <w:hyperlink w:anchor="_Toc242111088" w:history="1">
+      <w:hyperlink w:anchor="_Toc242114655" w:history="1">
         <w:r>
           <w:rPr>
             <w:rStyle w:val="Hyperlink"/>
@@ -1368,7 +1368,82 @@
             <w:noProof/>
             <w:webHidden/>
           </w:rPr>
-          <w:instrText xml:space="preserve"> PAGEREF _Toc242111088 \h </w:instrText>
+          <w:instrText xml:space="preserve"> PAGEREF _Toc242114655 \h </w:instrText>
+        </w:r>
+        <w:r>
+          <w:rPr>
+            <w:noProof/>
+            <w:webHidden/>
+          </w:rPr>
+        </w:r>
+        <w:r>
+          <w:rPr>
+            <w:noProof/>
+            <w:webHidden/>
+          </w:rPr>
+          <w:fldChar w:fldCharType="separate"/>
+        </w:r>
+        <w:r>
+          <w:rPr>
+            <w:noProof/>
+            <w:webHidden/>
+          </w:rPr>
+          <w:t>14</w:t>
+        </w:r>
+        <w:r>
+          <w:rPr>
+            <w:noProof/>
+            <w:webHidden/>
+          </w:rPr>
+          <w:fldChar w:fldCharType="end"/>
+        </w:r>
+      </w:hyperlink>
+    </w:p>
+    <w:p>
+      <w:pPr>
+        <w:pStyle w:val="TOC2"/>
+        <w:tabs>
+          <w:tab w:val="right" w:leader="dot" w:pos="7927"/>
+        </w:tabs>
+        <w:spacing w:after="0"/>
+        <w:rPr>
+          <w:rFonts w:asciiTheme="minorHAnsi" w:eastAsiaTheme="minorEastAsia" w:hAnsiTheme="minorHAnsi" w:cstheme="minorBidi"/>
+          <w:noProof/>
+          <w:color w:val="auto"/>
+          <w:kern w:val="2"/>
+          <w:szCs w:val="24"/>
+          <w:lang w:val="en-ID" w:eastAsia="en-ID"/>
+          <w14:ligatures w14:val="standardContextual"/>
+        </w:rPr>
+      </w:pPr>
+      <w:hyperlink w:anchor="_Toc242114656" w:history="1">
+        <w:r>
+          <w:rPr>
+            <w:rStyle w:val="Hyperlink"/>
+            <w:noProof/>
+          </w:rPr>
+          <w:t>2 8 Model Budget Tiket dan Jarak</w:t>
+        </w:r>
+        <w:r>
+          <w:rPr>
+            <w:noProof/>
+            <w:webHidden/>
+          </w:rPr>
+          <w:tab/>
+        </w:r>
+        <w:r>
+          <w:rPr>
+            <w:noProof/>
+            <w:webHidden/>
+          </w:rPr>
+          <w:fldChar w:fldCharType="begin"/>
+        </w:r>
+        <w:r>
+          <w:rPr>
+            <w:noProof/>
+            <w:webHidden/>
+          </w:rPr>
+          <w:instrText xml:space="preserve"> PAGEREF _Toc242114656 \h </w:instrText>
         </w:r>
         <w:r>
           <w:rPr>
@@ -1416,82 +1491,7 @@
           <w14:ligatures w14:val="standardContextual"/>
         </w:rPr>
       </w:pPr>
-      <w:hyperlink w:anchor="_Toc242111089" w:history="1">
-        <w:r>
-          <w:rPr>
-            <w:rStyle w:val="Hyperlink"/>
-            <w:noProof/>
-          </w:rPr>
-          <w:t>2 8 Model Budget Tiket dan Jarak</w:t>
-        </w:r>
-        <w:r>
-          <w:rPr>
-            <w:noProof/>
-            <w:webHidden/>
-          </w:rPr>
-          <w:tab/>
-        </w:r>
-        <w:r>
-          <w:rPr>
-            <w:noProof/>
-            <w:webHidden/>
-          </w:rPr>
-          <w:fldChar w:fldCharType="begin"/>
-        </w:r>
-        <w:r>
-          <w:rPr>
-            <w:noProof/>
-            <w:webHidden/>
-          </w:rPr>
-          <w:instrText xml:space="preserve"> PAGEREF _Toc242111089 \h </w:instrText>
-        </w:r>
-        <w:r>
-          <w:rPr>
-            <w:noProof/>
-            <w:webHidden/>
-          </w:rPr>
-        </w:r>
-        <w:r>
-          <w:rPr>
-            <w:noProof/>
-            <w:webHidden/>
-          </w:rPr>
-          <w:fldChar w:fldCharType="separate"/>
-        </w:r>
-        <w:r>
-          <w:rPr>
-            <w:noProof/>
-            <w:webHidden/>
-          </w:rPr>
-          <w:t>15</w:t>
-        </w:r>
-        <w:r>
-          <w:rPr>
-            <w:noProof/>
-            <w:webHidden/>
-          </w:rPr>
-          <w:fldChar w:fldCharType="end"/>
-        </w:r>
-      </w:hyperlink>
-    </w:p>
-    <w:p>
-      <w:pPr>
-        <w:pStyle w:val="TOC2"/>
-        <w:tabs>
-          <w:tab w:val="right" w:leader="dot" w:pos="7927"/>
-        </w:tabs>
-        <w:spacing w:after="0"/>
-        <w:rPr>
-          <w:rFonts w:asciiTheme="minorHAnsi" w:eastAsiaTheme="minorEastAsia" w:hAnsiTheme="minorHAnsi" w:cstheme="minorBidi"/>
-          <w:noProof/>
-          <w:color w:val="auto"/>
-          <w:kern w:val="2"/>
-          <w:szCs w:val="24"/>
-          <w:lang w:val="en-ID" w:eastAsia="en-ID"/>
-          <w14:ligatures w14:val="standardContextual"/>
-        </w:rPr>
-      </w:pPr>
-      <w:hyperlink w:anchor="_Toc242111090" w:history="1">
+      <w:hyperlink w:anchor="_Toc242114657" w:history="1">
         <w:r>
           <w:rPr>
             <w:rStyle w:val="Hyperlink"/>
@@ -1518,7 +1518,7 @@
             <w:noProof/>
             <w:webHidden/>
           </w:rPr>
-          <w:instrText xml:space="preserve"> PAGEREF _Toc242111090 \h </w:instrText>
+          <w:instrText xml:space="preserve"> PAGEREF _Toc242114657 \h </w:instrText>
         </w:r>
         <w:r>
           <w:rPr>
@@ -1566,13 +1566,13 @@
           <w14:ligatures w14:val="standardContextual"/>
         </w:rPr>
       </w:pPr>
-      <w:hyperlink w:anchor="_Toc242111091" w:history="1">
+      <w:hyperlink w:anchor="_Toc242114658" w:history="1">
         <w:r>
           <w:rPr>
             <w:rStyle w:val="Hyperlink"/>
             <w:noProof/>
           </w:rPr>
-          <w:t>2 10 Rancangan Validasi Data Mining dan Rekomendasi</w:t>
+          <w:t>2 10 Validasi Data Mining dan Rekomendasi</w:t>
         </w:r>
         <w:r>
           <w:rPr>
@@ -1593,7 +1593,7 @@
             <w:noProof/>
             <w:webHidden/>
           </w:rPr>
-          <w:instrText xml:space="preserve"> PAGEREF _Toc242111091 \h </w:instrText>
+          <w:instrText xml:space="preserve"> PAGEREF _Toc242114658 \h </w:instrText>
         </w:r>
         <w:r>
           <w:rPr>
@@ -1613,7 +1613,7 @@
             <w:noProof/>
             <w:webHidden/>
           </w:rPr>
-          <w:t>18</w:t>
+          <w:t>17</w:t>
         </w:r>
         <w:r>
           <w:rPr>
@@ -1641,7 +1641,7 @@
           <w14:ligatures w14:val="standardContextual"/>
         </w:rPr>
       </w:pPr>
-      <w:hyperlink w:anchor="_Toc242111092" w:history="1">
+      <w:hyperlink w:anchor="_Toc242114659" w:history="1">
         <w:r>
           <w:rPr>
             <w:rStyle w:val="Hyperlink"/>
@@ -1668,7 +1668,232 @@
             <w:noProof/>
             <w:webHidden/>
           </w:rPr>
-          <w:instrText xml:space="preserve"> PAGEREF _Toc242111092 \h </w:instrText>
+          <w:instrText xml:space="preserve"> PAGEREF _Toc242114659 \h </w:instrText>
+        </w:r>
+        <w:r>
+          <w:rPr>
+            <w:noProof/>
+            <w:webHidden/>
+          </w:rPr>
+        </w:r>
+        <w:r>
+          <w:rPr>
+            <w:noProof/>
+            <w:webHidden/>
+          </w:rPr>
+          <w:fldChar w:fldCharType="separate"/>
+        </w:r>
+        <w:r>
+          <w:rPr>
+            <w:noProof/>
+            <w:webHidden/>
+          </w:rPr>
+          <w:t>19</w:t>
+        </w:r>
+        <w:r>
+          <w:rPr>
+            <w:noProof/>
+            <w:webHidden/>
+          </w:rPr>
+          <w:fldChar w:fldCharType="end"/>
+        </w:r>
+      </w:hyperlink>
+    </w:p>
+    <w:p>
+      <w:pPr>
+        <w:pStyle w:val="TOC2"/>
+        <w:tabs>
+          <w:tab w:val="right" w:leader="dot" w:pos="7927"/>
+        </w:tabs>
+        <w:spacing w:after="0"/>
+        <w:rPr>
+          <w:rFonts w:asciiTheme="minorHAnsi" w:eastAsiaTheme="minorEastAsia" w:hAnsiTheme="minorHAnsi" w:cstheme="minorBidi"/>
+          <w:noProof/>
+          <w:color w:val="auto"/>
+          <w:kern w:val="2"/>
+          <w:szCs w:val="24"/>
+          <w:lang w:val="en-ID" w:eastAsia="en-ID"/>
+          <w14:ligatures w14:val="standardContextual"/>
+        </w:rPr>
+      </w:pPr>
+      <w:hyperlink w:anchor="_Toc242114660" w:history="1">
+        <w:r>
+          <w:rPr>
+            <w:rStyle w:val="Hyperlink"/>
+            <w:noProof/>
+          </w:rPr>
+          <w:t>3 1 Berkas Bukti dan README</w:t>
+        </w:r>
+        <w:r>
+          <w:rPr>
+            <w:noProof/>
+            <w:webHidden/>
+          </w:rPr>
+          <w:tab/>
+        </w:r>
+        <w:r>
+          <w:rPr>
+            <w:noProof/>
+            <w:webHidden/>
+          </w:rPr>
+          <w:fldChar w:fldCharType="begin"/>
+        </w:r>
+        <w:r>
+          <w:rPr>
+            <w:noProof/>
+            <w:webHidden/>
+          </w:rPr>
+          <w:instrText xml:space="preserve"> PAGEREF _Toc242114660 \h </w:instrText>
+        </w:r>
+        <w:r>
+          <w:rPr>
+            <w:noProof/>
+            <w:webHidden/>
+          </w:rPr>
+        </w:r>
+        <w:r>
+          <w:rPr>
+            <w:noProof/>
+            <w:webHidden/>
+          </w:rPr>
+          <w:fldChar w:fldCharType="separate"/>
+        </w:r>
+        <w:r>
+          <w:rPr>
+            <w:noProof/>
+            <w:webHidden/>
+          </w:rPr>
+          <w:t>19</w:t>
+        </w:r>
+        <w:r>
+          <w:rPr>
+            <w:noProof/>
+            <w:webHidden/>
+          </w:rPr>
+          <w:fldChar w:fldCharType="end"/>
+        </w:r>
+      </w:hyperlink>
+    </w:p>
+    <w:p>
+      <w:pPr>
+        <w:pStyle w:val="TOC2"/>
+        <w:tabs>
+          <w:tab w:val="right" w:leader="dot" w:pos="7927"/>
+        </w:tabs>
+        <w:spacing w:after="0"/>
+        <w:rPr>
+          <w:rFonts w:asciiTheme="minorHAnsi" w:eastAsiaTheme="minorEastAsia" w:hAnsiTheme="minorHAnsi" w:cstheme="minorBidi"/>
+          <w:noProof/>
+          <w:color w:val="auto"/>
+          <w:kern w:val="2"/>
+          <w:szCs w:val="24"/>
+          <w:lang w:val="en-ID" w:eastAsia="en-ID"/>
+          <w14:ligatures w14:val="standardContextual"/>
+        </w:rPr>
+      </w:pPr>
+      <w:hyperlink w:anchor="_Toc242114661" w:history="1">
+        <w:r>
+          <w:rPr>
+            <w:rStyle w:val="Hyperlink"/>
+            <w:noProof/>
+          </w:rPr>
+          <w:t>3 2 Skenario Perhitungan dari Snapshot Aplikasi</w:t>
+        </w:r>
+        <w:r>
+          <w:rPr>
+            <w:noProof/>
+            <w:webHidden/>
+          </w:rPr>
+          <w:tab/>
+        </w:r>
+        <w:r>
+          <w:rPr>
+            <w:noProof/>
+            <w:webHidden/>
+          </w:rPr>
+          <w:fldChar w:fldCharType="begin"/>
+        </w:r>
+        <w:r>
+          <w:rPr>
+            <w:noProof/>
+            <w:webHidden/>
+          </w:rPr>
+          <w:instrText xml:space="preserve"> PAGEREF _Toc242114661 \h </w:instrText>
+        </w:r>
+        <w:r>
+          <w:rPr>
+            <w:noProof/>
+            <w:webHidden/>
+          </w:rPr>
+        </w:r>
+        <w:r>
+          <w:rPr>
+            <w:noProof/>
+            <w:webHidden/>
+          </w:rPr>
+          <w:fldChar w:fldCharType="separate"/>
+        </w:r>
+        <w:r>
+          <w:rPr>
+            <w:noProof/>
+            <w:webHidden/>
+          </w:rPr>
+          <w:t>19</w:t>
+        </w:r>
+        <w:r>
+          <w:rPr>
+            <w:noProof/>
+            <w:webHidden/>
+          </w:rPr>
+          <w:fldChar w:fldCharType="end"/>
+        </w:r>
+      </w:hyperlink>
+    </w:p>
+    <w:p>
+      <w:pPr>
+        <w:pStyle w:val="TOC2"/>
+        <w:tabs>
+          <w:tab w:val="right" w:leader="dot" w:pos="7927"/>
+        </w:tabs>
+        <w:spacing w:after="0"/>
+        <w:rPr>
+          <w:rFonts w:asciiTheme="minorHAnsi" w:eastAsiaTheme="minorEastAsia" w:hAnsiTheme="minorHAnsi" w:cstheme="minorBidi"/>
+          <w:noProof/>
+          <w:color w:val="auto"/>
+          <w:kern w:val="2"/>
+          <w:szCs w:val="24"/>
+          <w:lang w:val="en-ID" w:eastAsia="en-ID"/>
+          <w14:ligatures w14:val="standardContextual"/>
+        </w:rPr>
+      </w:pPr>
+      <w:hyperlink w:anchor="_Toc242114662" w:history="1">
+        <w:r>
+          <w:rPr>
+            <w:rStyle w:val="Hyperlink"/>
+            <w:noProof/>
+          </w:rPr>
+          <w:t>3 3 Pembuktian Bobot AHP</w:t>
+        </w:r>
+        <w:r>
+          <w:rPr>
+            <w:noProof/>
+            <w:webHidden/>
+          </w:rPr>
+          <w:tab/>
+        </w:r>
+        <w:r>
+          <w:rPr>
+            <w:noProof/>
+            <w:webHidden/>
+          </w:rPr>
+          <w:fldChar w:fldCharType="begin"/>
+        </w:r>
+        <w:r>
+          <w:rPr>
+            <w:noProof/>
+            <w:webHidden/>
+          </w:rPr>
+          <w:instrText xml:space="preserve"> PAGEREF _Toc242114662 \h </w:instrText>
         </w:r>
         <w:r>
           <w:rPr>
@@ -1716,13 +1941,13 @@
           <w14:ligatures w14:val="standardContextual"/>
         </w:rPr>
       </w:pPr>
-      <w:hyperlink w:anchor="_Toc242111093" w:history="1">
+      <w:hyperlink w:anchor="_Toc242114663" w:history="1">
         <w:r>
           <w:rPr>
             <w:rStyle w:val="Hyperlink"/>
             <w:noProof/>
           </w:rPr>
-          <w:t>3 1 Berkas Bukti dan README</w:t>
+          <w:t>3 4 Pembuktian Harga Tiket C1</w:t>
         </w:r>
         <w:r>
           <w:rPr>
@@ -1743,157 +1968,7 @@
             <w:noProof/>
             <w:webHidden/>
           </w:rPr>
-          <w:instrText xml:space="preserve"> PAGEREF _Toc242111093 \h </w:instrText>
-        </w:r>
-        <w:r>
-          <w:rPr>
-            <w:noProof/>
-            <w:webHidden/>
-          </w:rPr>
-        </w:r>
-        <w:r>
-          <w:rPr>
-            <w:noProof/>
-            <w:webHidden/>
-          </w:rPr>
-          <w:fldChar w:fldCharType="separate"/>
-        </w:r>
-        <w:r>
-          <w:rPr>
-            <w:noProof/>
-            <w:webHidden/>
-          </w:rPr>
-          <w:t>20</w:t>
-        </w:r>
-        <w:r>
-          <w:rPr>
-            <w:noProof/>
-            <w:webHidden/>
-          </w:rPr>
-          <w:fldChar w:fldCharType="end"/>
-        </w:r>
-      </w:hyperlink>
-    </w:p>
-    <w:p>
-      <w:pPr>
-        <w:pStyle w:val="TOC2"/>
-        <w:tabs>
-          <w:tab w:val="right" w:leader="dot" w:pos="7927"/>
-        </w:tabs>
-        <w:spacing w:after="0"/>
-        <w:rPr>
-          <w:rFonts w:asciiTheme="minorHAnsi" w:eastAsiaTheme="minorEastAsia" w:hAnsiTheme="minorHAnsi" w:cstheme="minorBidi"/>
-          <w:noProof/>
-          <w:color w:val="auto"/>
-          <w:kern w:val="2"/>
-          <w:szCs w:val="24"/>
-          <w:lang w:val="en-ID" w:eastAsia="en-ID"/>
-          <w14:ligatures w14:val="standardContextual"/>
-        </w:rPr>
-      </w:pPr>
-      <w:hyperlink w:anchor="_Toc242111094" w:history="1">
-        <w:r>
-          <w:rPr>
-            <w:rStyle w:val="Hyperlink"/>
-            <w:noProof/>
-          </w:rPr>
-          <w:t>3 2 Skenario Perhitungan dari Snapshot Aplikasi</w:t>
-        </w:r>
-        <w:r>
-          <w:rPr>
-            <w:noProof/>
-            <w:webHidden/>
-          </w:rPr>
-          <w:tab/>
-        </w:r>
-        <w:r>
-          <w:rPr>
-            <w:noProof/>
-            <w:webHidden/>
-          </w:rPr>
-          <w:fldChar w:fldCharType="begin"/>
-        </w:r>
-        <w:r>
-          <w:rPr>
-            <w:noProof/>
-            <w:webHidden/>
-          </w:rPr>
-          <w:instrText xml:space="preserve"> PAGEREF _Toc242111094 \h </w:instrText>
-        </w:r>
-        <w:r>
-          <w:rPr>
-            <w:noProof/>
-            <w:webHidden/>
-          </w:rPr>
-        </w:r>
-        <w:r>
-          <w:rPr>
-            <w:noProof/>
-            <w:webHidden/>
-          </w:rPr>
-          <w:fldChar w:fldCharType="separate"/>
-        </w:r>
-        <w:r>
-          <w:rPr>
-            <w:noProof/>
-            <w:webHidden/>
-          </w:rPr>
-          <w:t>20</w:t>
-        </w:r>
-        <w:r>
-          <w:rPr>
-            <w:noProof/>
-            <w:webHidden/>
-          </w:rPr>
-          <w:fldChar w:fldCharType="end"/>
-        </w:r>
-      </w:hyperlink>
-    </w:p>
-    <w:p>
-      <w:pPr>
-        <w:pStyle w:val="TOC2"/>
-        <w:tabs>
-          <w:tab w:val="right" w:leader="dot" w:pos="7927"/>
-        </w:tabs>
-        <w:spacing w:after="0"/>
-        <w:rPr>
-          <w:rFonts w:asciiTheme="minorHAnsi" w:eastAsiaTheme="minorEastAsia" w:hAnsiTheme="minorHAnsi" w:cstheme="minorBidi"/>
-          <w:noProof/>
-          <w:color w:val="auto"/>
-          <w:kern w:val="2"/>
-          <w:szCs w:val="24"/>
-          <w:lang w:val="en-ID" w:eastAsia="en-ID"/>
-          <w14:ligatures w14:val="standardContextual"/>
-        </w:rPr>
-      </w:pPr>
-      <w:hyperlink w:anchor="_Toc242111095" w:history="1">
-        <w:r>
-          <w:rPr>
-            <w:rStyle w:val="Hyperlink"/>
-            <w:noProof/>
-          </w:rPr>
-          <w:t>3 3 Pembuktian Bobot AHP</w:t>
-        </w:r>
-        <w:r>
-          <w:rPr>
-            <w:noProof/>
-            <w:webHidden/>
-          </w:rPr>
-          <w:tab/>
-        </w:r>
-        <w:r>
-          <w:rPr>
-            <w:noProof/>
-            <w:webHidden/>
-          </w:rPr>
-          <w:fldChar w:fldCharType="begin"/>
-        </w:r>
-        <w:r>
-          <w:rPr>
-            <w:noProof/>
-            <w:webHidden/>
-          </w:rPr>
-          <w:instrText xml:space="preserve"> PAGEREF _Toc242111095 \h </w:instrText>
+          <w:instrText xml:space="preserve"> PAGEREF _Toc242114663 \h </w:instrText>
         </w:r>
         <w:r>
           <w:rPr>
@@ -1941,13 +2016,13 @@
           <w14:ligatures w14:val="standardContextual"/>
         </w:rPr>
       </w:pPr>
-      <w:hyperlink w:anchor="_Toc242111096" w:history="1">
+      <w:hyperlink w:anchor="_Toc242114664" w:history="1">
         <w:r>
           <w:rPr>
             <w:rStyle w:val="Hyperlink"/>
             <w:noProof/>
           </w:rPr>
-          <w:t>3 4 Pembuktian Harga Tiket C1</w:t>
+          <w:t>3 5 Matriks Keputusan dan Normalisasi TOPSIS</w:t>
         </w:r>
         <w:r>
           <w:rPr>
@@ -1968,7 +2043,7 @@
             <w:noProof/>
             <w:webHidden/>
           </w:rPr>
-          <w:instrText xml:space="preserve"> PAGEREF _Toc242111096 \h </w:instrText>
+          <w:instrText xml:space="preserve"> PAGEREF _Toc242114664 \h </w:instrText>
         </w:r>
         <w:r>
           <w:rPr>
@@ -2016,13 +2091,13 @@
           <w14:ligatures w14:val="standardContextual"/>
         </w:rPr>
       </w:pPr>
-      <w:hyperlink w:anchor="_Toc242111097" w:history="1">
+      <w:hyperlink w:anchor="_Toc242114665" w:history="1">
         <w:r>
           <w:rPr>
             <w:rStyle w:val="Hyperlink"/>
             <w:noProof/>
           </w:rPr>
-          <w:t>3 5 Matriks Keputusan dan Normalisasi TOPSIS</w:t>
+          <w:t>3 6 Solusi Ideal Jarak dan Ranking</w:t>
         </w:r>
         <w:r>
           <w:rPr>
@@ -2043,7 +2118,7 @@
             <w:noProof/>
             <w:webHidden/>
           </w:rPr>
-          <w:instrText xml:space="preserve"> PAGEREF _Toc242111097 \h </w:instrText>
+          <w:instrText xml:space="preserve"> PAGEREF _Toc242114665 \h </w:instrText>
         </w:r>
         <w:r>
           <w:rPr>
@@ -2091,13 +2166,13 @@
           <w14:ligatures w14:val="standardContextual"/>
         </w:rPr>
       </w:pPr>
-      <w:hyperlink w:anchor="_Toc242111098" w:history="1">
+      <w:hyperlink w:anchor="_Toc242114666" w:history="1">
         <w:r>
           <w:rPr>
             <w:rStyle w:val="Hyperlink"/>
             <w:noProof/>
           </w:rPr>
-          <w:t>3 6 Solusi Ideal Jarak dan Ranking</w:t>
+          <w:t>3 7 Pembanding SAW dan Sensitivitas</w:t>
         </w:r>
         <w:r>
           <w:rPr>
@@ -2118,7 +2193,7 @@
             <w:noProof/>
             <w:webHidden/>
           </w:rPr>
-          <w:instrText xml:space="preserve"> PAGEREF _Toc242111098 \h </w:instrText>
+          <w:instrText xml:space="preserve"> PAGEREF _Toc242114666 \h </w:instrText>
         </w:r>
         <w:r>
           <w:rPr>
@@ -2166,13 +2241,13 @@
           <w14:ligatures w14:val="standardContextual"/>
         </w:rPr>
       </w:pPr>
-      <w:hyperlink w:anchor="_Toc242111099" w:history="1">
+      <w:hyperlink w:anchor="_Toc242114667" w:history="1">
         <w:r>
           <w:rPr>
             <w:rStyle w:val="Hyperlink"/>
             <w:noProof/>
           </w:rPr>
-          <w:t>3 7 Pembanding SAW dan Sensitivitas</w:t>
+          <w:t>3 8 Reproduksi Perhitungan dan Keterbatasan</w:t>
         </w:r>
         <w:r>
           <w:rPr>
@@ -2193,7 +2268,7 @@
             <w:noProof/>
             <w:webHidden/>
           </w:rPr>
-          <w:instrText xml:space="preserve"> PAGEREF _Toc242111099 \h </w:instrText>
+          <w:instrText xml:space="preserve"> PAGEREF _Toc242114667 \h </w:instrText>
         </w:r>
         <w:r>
           <w:rPr>
@@ -2213,7 +2288,82 @@
             <w:noProof/>
             <w:webHidden/>
           </w:rPr>
-          <w:t>25</w:t>
+          <w:t>24</w:t>
+        </w:r>
+        <w:r>
+          <w:rPr>
+            <w:noProof/>
+            <w:webHidden/>
+          </w:rPr>
+          <w:fldChar w:fldCharType="end"/>
+        </w:r>
+      </w:hyperlink>
+    </w:p>
+    <w:p>
+      <w:pPr>
+        <w:pStyle w:val="TOC1"/>
+        <w:tabs>
+          <w:tab w:val="right" w:leader="dot" w:pos="7927"/>
+        </w:tabs>
+        <w:spacing w:after="0"/>
+        <w:rPr>
+          <w:rFonts w:asciiTheme="minorHAnsi" w:eastAsiaTheme="minorEastAsia" w:hAnsiTheme="minorHAnsi" w:cstheme="minorBidi"/>
+          <w:noProof/>
+          <w:color w:val="auto"/>
+          <w:kern w:val="2"/>
+          <w:szCs w:val="24"/>
+          <w:lang w:val="en-ID" w:eastAsia="en-ID"/>
+          <w14:ligatures w14:val="standardContextual"/>
+        </w:rPr>
+      </w:pPr>
+      <w:hyperlink w:anchor="_Toc242114668" w:history="1">
+        <w:r>
+          <w:rPr>
+            <w:rStyle w:val="Hyperlink"/>
+            <w:noProof/>
+          </w:rPr>
+          <w:t>BAB 4 LOGBOOK DAN JADWAL KEGIATAN</w:t>
+        </w:r>
+        <w:r>
+          <w:rPr>
+            <w:noProof/>
+            <w:webHidden/>
+          </w:rPr>
+          <w:tab/>
+        </w:r>
+        <w:r>
+          <w:rPr>
+            <w:noProof/>
+            <w:webHidden/>
+          </w:rPr>
+          <w:fldChar w:fldCharType="begin"/>
+        </w:r>
+        <w:r>
+          <w:rPr>
+            <w:noProof/>
+            <w:webHidden/>
+          </w:rPr>
+          <w:instrText xml:space="preserve"> PAGEREF _Toc242114668 \h </w:instrText>
+        </w:r>
+        <w:r>
+          <w:rPr>
+            <w:noProof/>
+            <w:webHidden/>
+          </w:rPr>
+        </w:r>
+        <w:r>
+          <w:rPr>
+            <w:noProof/>
+            <w:webHidden/>
+          </w:rPr>
+          <w:fldChar w:fldCharType="separate"/>
+        </w:r>
+        <w:r>
+          <w:rPr>
+            <w:noProof/>
+            <w:webHidden/>
+          </w:rPr>
+          <w:t>26</w:t>
         </w:r>
         <w:r>
           <w:rPr>
@@ -2241,13 +2391,13 @@
           <w14:ligatures w14:val="standardContextual"/>
         </w:rPr>
       </w:pPr>
-      <w:hyperlink w:anchor="_Toc242111100" w:history="1">
+      <w:hyperlink w:anchor="_Toc242114669" w:history="1">
         <w:r>
           <w:rPr>
             <w:rStyle w:val="Hyperlink"/>
             <w:noProof/>
           </w:rPr>
-          <w:t>3 8 Reproduksi Perhitungan dan Keterbatasan</w:t>
+          <w:t>4 1 Logbook Harian</w:t>
         </w:r>
         <w:r>
           <w:rPr>
@@ -2268,7 +2418,7 @@
             <w:noProof/>
             <w:webHidden/>
           </w:rPr>
-          <w:instrText xml:space="preserve"> PAGEREF _Toc242111100 \h </w:instrText>
+          <w:instrText xml:space="preserve"> PAGEREF _Toc242114669 \h </w:instrText>
         </w:r>
         <w:r>
           <w:rPr>
@@ -2288,7 +2438,7 @@
             <w:noProof/>
             <w:webHidden/>
           </w:rPr>
-          <w:t>25</w:t>
+          <w:t>26</w:t>
         </w:r>
         <w:r>
           <w:rPr>
@@ -2301,7 +2451,7 @@
     </w:p>
     <w:p>
       <w:pPr>
-        <w:pStyle w:val="TOC1"/>
+        <w:pStyle w:val="TOC2"/>
         <w:tabs>
           <w:tab w:val="right" w:leader="dot" w:pos="7927"/>
         </w:tabs>
@@ -2316,13 +2466,13 @@
           <w14:ligatures w14:val="standardContextual"/>
         </w:rPr>
       </w:pPr>
-      <w:hyperlink w:anchor="_Toc242111101" w:history="1">
+      <w:hyperlink w:anchor="_Toc242114670" w:history="1">
         <w:r>
           <w:rPr>
             <w:rStyle w:val="Hyperlink"/>
             <w:noProof/>
           </w:rPr>
-          <w:t>BAB 4 LOGBOOK DAN JADWAL KEGIATAN</w:t>
+          <w:t>4 2 Jadwal Kegiatan dari Awal sampai Implementasi</w:t>
         </w:r>
         <w:r>
           <w:rPr>
@@ -2343,7 +2493,7 @@
             <w:noProof/>
             <w:webHidden/>
           </w:rPr>
-          <w:instrText xml:space="preserve"> PAGEREF _Toc242111101 \h </w:instrText>
+          <w:instrText xml:space="preserve"> PAGEREF _Toc242114670 \h </w:instrText>
         </w:r>
         <w:r>
           <w:rPr>
@@ -2391,13 +2541,13 @@
           <w14:ligatures w14:val="standardContextual"/>
         </w:rPr>
       </w:pPr>
-      <w:hyperlink w:anchor="_Toc242111102" w:history="1">
+      <w:hyperlink w:anchor="_Toc242114671" w:history="1">
         <w:r>
           <w:rPr>
             <w:rStyle w:val="Hyperlink"/>
             <w:noProof/>
           </w:rPr>
-          <w:t>4 1 Logbook Harian</w:t>
+          <w:t>4 3 Status Implementasi Project</w:t>
         </w:r>
         <w:r>
           <w:rPr>
@@ -2418,82 +2568,7 @@
             <w:noProof/>
             <w:webHidden/>
           </w:rPr>
-          <w:instrText xml:space="preserve"> PAGEREF _Toc242111102 \h </w:instrText>
-        </w:r>
-        <w:r>
-          <w:rPr>
-            <w:noProof/>
-            <w:webHidden/>
-          </w:rPr>
-        </w:r>
-        <w:r>
-          <w:rPr>
-            <w:noProof/>
-            <w:webHidden/>
-          </w:rPr>
-          <w:fldChar w:fldCharType="separate"/>
-        </w:r>
-        <w:r>
-          <w:rPr>
-            <w:noProof/>
-            <w:webHidden/>
-          </w:rPr>
-          <w:t>27</w:t>
-        </w:r>
-        <w:r>
-          <w:rPr>
-            <w:noProof/>
-            <w:webHidden/>
-          </w:rPr>
-          <w:fldChar w:fldCharType="end"/>
-        </w:r>
-      </w:hyperlink>
-    </w:p>
-    <w:p>
-      <w:pPr>
-        <w:pStyle w:val="TOC2"/>
-        <w:tabs>
-          <w:tab w:val="right" w:leader="dot" w:pos="7927"/>
-        </w:tabs>
-        <w:spacing w:after="0"/>
-        <w:rPr>
-          <w:rFonts w:asciiTheme="minorHAnsi" w:eastAsiaTheme="minorEastAsia" w:hAnsiTheme="minorHAnsi" w:cstheme="minorBidi"/>
-          <w:noProof/>
-          <w:color w:val="auto"/>
-          <w:kern w:val="2"/>
-          <w:szCs w:val="24"/>
-          <w:lang w:val="en-ID" w:eastAsia="en-ID"/>
-          <w14:ligatures w14:val="standardContextual"/>
-        </w:rPr>
-      </w:pPr>
-      <w:hyperlink w:anchor="_Toc242111103" w:history="1">
-        <w:r>
-          <w:rPr>
-            <w:rStyle w:val="Hyperlink"/>
-            <w:noProof/>
-          </w:rPr>
-          <w:t>4 2 Jadwal Kegiatan dari Awal sampai Implementasi</w:t>
-        </w:r>
-        <w:r>
-          <w:rPr>
-            <w:noProof/>
-            <w:webHidden/>
-          </w:rPr>
-          <w:tab/>
-        </w:r>
-        <w:r>
-          <w:rPr>
-            <w:noProof/>
-            <w:webHidden/>
-          </w:rPr>
-          <w:fldChar w:fldCharType="begin"/>
-        </w:r>
-        <w:r>
-          <w:rPr>
-            <w:noProof/>
-            <w:webHidden/>
-          </w:rPr>
-          <w:instrText xml:space="preserve"> PAGEREF _Toc242111103 \h </w:instrText>
+          <w:instrText xml:space="preserve"> PAGEREF _Toc242114671 \h </w:instrText>
         </w:r>
         <w:r>
           <w:rPr>
@@ -2526,7 +2601,7 @@
     </w:p>
     <w:p>
       <w:pPr>
-        <w:pStyle w:val="TOC2"/>
+        <w:pStyle w:val="TOC1"/>
         <w:tabs>
           <w:tab w:val="right" w:leader="dot" w:pos="7927"/>
         </w:tabs>
@@ -2541,13 +2616,13 @@
           <w14:ligatures w14:val="standardContextual"/>
         </w:rPr>
       </w:pPr>
-      <w:hyperlink w:anchor="_Toc242111104" w:history="1">
+      <w:hyperlink w:anchor="_Toc242114672" w:history="1">
         <w:r>
           <w:rPr>
             <w:rStyle w:val="Hyperlink"/>
             <w:noProof/>
           </w:rPr>
-          <w:t>4 3 Status Implementasi dan Kegiatan Lanjutan</w:t>
+          <w:t>DAFTAR PUSTAKA</w:t>
         </w:r>
         <w:r>
           <w:rPr>
@@ -2568,7 +2643,7 @@
             <w:noProof/>
             <w:webHidden/>
           </w:rPr>
-          <w:instrText xml:space="preserve"> PAGEREF _Toc242111104 \h </w:instrText>
+          <w:instrText xml:space="preserve"> PAGEREF _Toc242114672 \h </w:instrText>
         </w:r>
         <w:r>
           <w:rPr>
@@ -2601,81 +2676,6 @@
     </w:p>
     <w:p>
       <w:pPr>
-        <w:pStyle w:val="TOC1"/>
-        <w:tabs>
-          <w:tab w:val="right" w:leader="dot" w:pos="7927"/>
-        </w:tabs>
-        <w:spacing w:after="0"/>
-        <w:rPr>
-          <w:rFonts w:asciiTheme="minorHAnsi" w:eastAsiaTheme="minorEastAsia" w:hAnsiTheme="minorHAnsi" w:cstheme="minorBidi"/>
-          <w:noProof/>
-          <w:color w:val="auto"/>
-          <w:kern w:val="2"/>
-          <w:szCs w:val="24"/>
-          <w:lang w:val="en-ID" w:eastAsia="en-ID"/>
-          <w14:ligatures w14:val="standardContextual"/>
-        </w:rPr>
-      </w:pPr>
-      <w:hyperlink w:anchor="_Toc242111105" w:history="1">
-        <w:r>
-          <w:rPr>
-            <w:rStyle w:val="Hyperlink"/>
-            <w:noProof/>
-          </w:rPr>
-          <w:t>DAFTAR PUSTAKA</w:t>
-        </w:r>
-        <w:r>
-          <w:rPr>
-            <w:noProof/>
-            <w:webHidden/>
-          </w:rPr>
-          <w:tab/>
-        </w:r>
-        <w:r>
-          <w:rPr>
-            <w:noProof/>
-            <w:webHidden/>
-          </w:rPr>
-          <w:fldChar w:fldCharType="begin"/>
-        </w:r>
-        <w:r>
-          <w:rPr>
-            <w:noProof/>
-            <w:webHidden/>
-          </w:rPr>
-          <w:instrText xml:space="preserve"> PAGEREF _Toc242111105 \h </w:instrText>
-        </w:r>
-        <w:r>
-          <w:rPr>
-            <w:noProof/>
-            <w:webHidden/>
-          </w:rPr>
-        </w:r>
-        <w:r>
-          <w:rPr>
-            <w:noProof/>
-            <w:webHidden/>
-          </w:rPr>
-          <w:fldChar w:fldCharType="separate"/>
-        </w:r>
-        <w:r>
-          <w:rPr>
-            <w:noProof/>
-            <w:webHidden/>
-          </w:rPr>
-          <w:t>30</w:t>
-        </w:r>
-        <w:r>
-          <w:rPr>
-            <w:noProof/>
-            <w:webHidden/>
-          </w:rPr>
-          <w:fldChar w:fldCharType="end"/>
-        </w:r>
-      </w:hyperlink>
-    </w:p>
-    <w:p>
-      <w:pPr>
         <w:spacing w:after="0"/>
       </w:pPr>
       <w:r>
@@ -2687,7 +2687,7 @@
         <w:pStyle w:val="Heading1"/>
         <w:pageBreakBefore/>
       </w:pPr>
-      <w:bookmarkStart w:id="0" w:name="_Toc242111072"/>
+      <w:bookmarkStart w:id="0" w:name="_Toc242114639"/>
       <w:r>
         <w:lastRenderedPageBreak/>
         <w:t>BAB 1 PENDAHULUAN DAN INTELLIGENCE</w:t>
@@ -2698,7 +2698,7 @@
       <w:pPr>
         <w:pStyle w:val="Heading2"/>
       </w:pPr>
-      <w:bookmarkStart w:id="1" w:name="_Toc242111073"/>
+      <w:bookmarkStart w:id="1" w:name="_Toc242114640"/>
       <w:r>
         <w:t>1 1 Latar Belakang</w:t>
       </w:r>
@@ -2723,7 +2723,7 @@
       <w:pPr>
         <w:pStyle w:val="Heading2"/>
       </w:pPr>
-      <w:bookmarkStart w:id="2" w:name="_Toc242111074"/>
+      <w:bookmarkStart w:id="2" w:name="_Toc242114641"/>
       <w:r>
         <w:t>1 2 Identifikasi Masalah</w:t>
       </w:r>
@@ -2752,7 +2752,7 @@
       <w:pPr>
         <w:pStyle w:val="Heading2"/>
       </w:pPr>
-      <w:bookmarkStart w:id="3" w:name="_Toc242111075"/>
+      <w:bookmarkStart w:id="3" w:name="_Toc242114642"/>
       <w:r>
         <w:t>1 3 Tujuan dan Manfaat</w:t>
       </w:r>
@@ -2772,7 +2772,7 @@
       <w:pPr>
         <w:pStyle w:val="Heading2"/>
       </w:pPr>
-      <w:bookmarkStart w:id="4" w:name="_Toc242111076"/>
+      <w:bookmarkStart w:id="4" w:name="_Toc242114643"/>
       <w:r>
         <w:t>1 4 Ruang Lingkup</w:t>
       </w:r>
@@ -2790,14 +2790,14 @@
     </w:p>
     <w:p>
       <w:r>
-        <w:t>Dataset sintetis 1.900 baris dan gabungan lama 2.337 baris berada dalam arsip dan bukan input aktif website atau pelatihan model. Sistem belum mencakup pemesanan tiket, optimasi rute banyak destinasi, jadwal operasional lengkap, prakiraan cuaca, atau verifikasi langsung setiap fasilitas. Evaluasi respons pengguna melalui survei merupakan kegiatan lanjutan, belum hasil penelitian pada snapshot ini.</w:t>
+        <w:t>Data aktif terdiri atas 437 destinasi Kaggle dan 6 destinasi tambahan hasil kurasi. Lingkup perhitungan adalah pemilihan satu destinasi berdasarkan enam kriteria. Pengguna memasukkan preferensi melalui formulir, lalu sistem menyaring kandidat berdasarkan provinsi dan budget tiket sebelum menghitung peringkat TOPSIS.</w:t>
       </w:r>
     </w:p>
     <w:p>
       <w:pPr>
         <w:pStyle w:val="Heading2"/>
       </w:pPr>
-      <w:bookmarkStart w:id="5" w:name="_Toc242111077"/>
+      <w:bookmarkStart w:id="5" w:name="_Toc242114644"/>
       <w:r>
         <w:lastRenderedPageBreak/>
         <w:t>1 5 Cara Pengumpulan Data</w:t>
@@ -3323,7 +3323,7 @@
       <w:pPr>
         <w:pStyle w:val="Heading2"/>
       </w:pPr>
-      <w:bookmarkStart w:id="6" w:name="_Toc242111078"/>
+      <w:bookmarkStart w:id="6" w:name="_Toc242114645"/>
       <w:r>
         <w:t>1 6 Gambaran dan Kualitas Data</w:t>
       </w:r>
@@ -4396,7 +4396,7 @@
       <w:pPr>
         <w:pStyle w:val="Heading2"/>
       </w:pPr>
-      <w:bookmarkStart w:id="7" w:name="_Toc242111079"/>
+      <w:bookmarkStart w:id="7" w:name="_Toc242114646"/>
       <w:r>
         <w:t>1 7 Kategorisasi Masalah dan Pengguna Akhir</w:t>
       </w:r>
@@ -4409,10 +4409,7 @@
     </w:p>
     <w:p>
       <w:r>
-        <w:t>Pengguna akhir utama adalah wisatawan yang merencanakan tujuan berdasarkan anggaran dan minat. Mahasiswa dan wisatawan dengan anggaran terbatas dapat menggunakan profil Hemat; pengguna yang menekankan rating dapat menggunakan profil Kualitas. Profil Petualang pada implementasi menekankan jarak dan kecocokan, bukan sertifikasi bahwa destinasi memiliki aktivitas petualangan. Profil Seimbang menjadi pilihan umum. Pengelola data merupakan pengguna administratif yang menjalankan preprocessing, impor, dan pembaru</w:t>
-      </w:r>
-      <w:r>
-        <w:t>an model.</w:t>
+        <w:t>Pengguna akhir utama adalah wisatawan yang merencanakan tujuan berdasarkan anggaran dan minat. Mahasiswa dan wisatawan dengan anggaran terbatas dapat menggunakan profil Hemat; pengguna yang menekankan rating dapat menggunakan profil Kualitas. Profil Petualang menekankan jarak dan kecocokan, sedangkan profil Seimbang menjadi pilihan umum. Pengelola data menjalankan preprocessing, impor, dan pembaruan model.</w:t>
       </w:r>
     </w:p>
     <w:p>
@@ -4424,7 +4421,7 @@
       <w:pPr>
         <w:pStyle w:val="Heading2"/>
       </w:pPr>
-      <w:bookmarkStart w:id="8" w:name="_Toc242111080"/>
+      <w:bookmarkStart w:id="8" w:name="_Toc242114647"/>
       <w:r>
         <w:t>1 8 Penerapan CRISP DM</w:t>
       </w:r>
@@ -4498,7 +4495,7 @@
     </w:p>
     <w:p>
       <w:r>
-        <w:t>Kami mengevaluasi konfigurasi k, silhouette, inertia, ukuran cluster, konsistensi AHP, hasil perhitungan, edge case, sensitivitas, dan integrasi aplikasi. Survei penerimaan pengguna belum menghasilkan ukuran empiris.</w:t>
+        <w:t>Kami mengevaluasi konfigurasi k, silhouette, inertia, ukuran cluster, konsistensi AHP, hasil perhitungan, edge case, sensitivitas, dan integrasi aplikasi. Evaluasi ini memeriksa hasil teknis model dan perhitungan SPK.</w:t>
       </w:r>
     </w:p>
     <w:p>
@@ -4519,7 +4516,7 @@
         <w:pStyle w:val="Heading1"/>
         <w:pageBreakBefore/>
       </w:pPr>
-      <w:bookmarkStart w:id="9" w:name="_Toc242111081"/>
+      <w:bookmarkStart w:id="9" w:name="_Toc242114648"/>
       <w:r>
         <w:lastRenderedPageBreak/>
         <w:t>BAB 2 PERANCANGAN DAN DESIGN</w:t>
@@ -4530,7 +4527,7 @@
       <w:pPr>
         <w:pStyle w:val="Heading2"/>
       </w:pPr>
-      <w:bookmarkStart w:id="10" w:name="_Toc242111082"/>
+      <w:bookmarkStart w:id="10" w:name="_Toc242114649"/>
       <w:r>
         <w:t>2 1 Model Masalah</w:t>
       </w:r>
@@ -5011,7 +5008,7 @@
       <w:pPr>
         <w:pStyle w:val="Heading2"/>
       </w:pPr>
-      <w:bookmarkStart w:id="11" w:name="_Toc242111083"/>
+      <w:bookmarkStart w:id="11" w:name="_Toc242114650"/>
       <w:r>
         <w:lastRenderedPageBreak/>
         <w:t>2 2 Arsitektur dan Alur Sistem</w:t>
@@ -5020,7 +5017,7 @@
     </w:p>
     <w:p>
       <w:r>
-        <w:t>Backend memakai Django dan SQLite. Pengolahan numerik menggunakan Python, pandas, dan NumPy. Frontend menggunakan template HTML, CSS, serta JavaScript native. Website tidak bergantung pada Next.js atau Flask pada implementasi aktif. Pemisahan modul memungkinkan rumus AHP, TOPSIS, harga tiket, jarak, dan kemiripan diuji secara terpisah dari tampilan.</w:t>
+        <w:t>Backend memakai Django dan SQLite. Pengolahan numerik menggunakan Python, pandas, dan NumPy. Frontend menggunakan template HTML, CSS, serta JavaScript native. Pemisahan modul memungkinkan rumus AHP, TOPSIS, harga tiket, jarak, dan kemiripan diuji secara terpisah dari tampilan.</w:t>
       </w:r>
     </w:p>
     <w:p>
@@ -5042,7 +5039,7 @@
       <w:pPr>
         <w:pStyle w:val="Heading2"/>
       </w:pPr>
-      <w:bookmarkStart w:id="12" w:name="_Toc242111084"/>
+      <w:bookmarkStart w:id="12" w:name="_Toc242114651"/>
       <w:r>
         <w:t>2 3 Perancangan Preprocessing</w:t>
       </w:r>
@@ -5086,7 +5083,7 @@
       <w:pPr>
         <w:pStyle w:val="Heading2"/>
       </w:pPr>
-      <w:bookmarkStart w:id="13" w:name="_Toc242111085"/>
+      <w:bookmarkStart w:id="13" w:name="_Toc242114652"/>
       <w:r>
         <w:t>2 4 Fitur dan Pemilihan Algoritma Data Mining</w:t>
       </w:r>
@@ -5150,10 +5147,7 @@
     <w:p>
       <w:r>
         <w:lastRenderedPageBreak/>
-        <w:t>Tabel kandidat algoritma berikut memenuhi kebutuhan perbandingan metode tanpa menciptakan hasil eksperimen. Accuracy, precision, recall, dan F1-score membutuhkan label acuan dan definisi kelas. Dataset ini tidak menyediakan label cluster acuan, sehingga metrik tersebut tidak berlaku untuk evaluasi clustering yang sedang dilakukan. Nilai N/A bukan nol. Decision Tree dan Random Forest hanya menjadi pilihan bila kelak ada target berlabel, misalnya relevansi rekomendasi dari pengguna (scikit-learn developers, n</w:t>
-      </w:r>
-      <w:r>
-        <w:t>.d.).</w:t>
+        <w:t>K-Means digunakan untuk mengelompokkan destinasi tanpa label acuan. Model menghasilkan centroid yang merangkum karakteristik setiap kelompok sehingga hasilnya dapat dijelaskan melalui harga, rating, dan kategori. Evaluasinya menggunakan silhouette, inertia, dan jumlah anggota cluster sesuai tujuan pengelompokan (scikit-learn developers, n.d.).</w:t>
       </w:r>
     </w:p>
     <w:p>
@@ -5163,7 +5157,7 @@
         <w:jc w:val="left"/>
       </w:pPr>
       <w:r>
-        <w:t>Tabel 5 Perbandingan kandidat algoritma dan metrik klasifikasi</w:t>
+        <w:t>Tabel 5 Konfigurasi K Means yang digunakan</w:t>
       </w:r>
     </w:p>
     <w:tbl>
@@ -5182,12 +5176,8 @@
         <w:tblLook w:val="04A0" w:firstRow="1" w:lastRow="0" w:firstColumn="1" w:lastColumn="0" w:noHBand="0" w:noVBand="1"/>
       </w:tblPr>
       <w:tblGrid>
-        <w:gridCol w:w="1814"/>
-        <w:gridCol w:w="1191"/>
-        <w:gridCol w:w="1191"/>
-        <w:gridCol w:w="850"/>
-        <w:gridCol w:w="850"/>
-        <w:gridCol w:w="2041"/>
+        <w:gridCol w:w="3402"/>
+        <w:gridCol w:w="4535"/>
       </w:tblGrid>
       <w:tr>
         <w:trPr>
@@ -5197,7 +5187,7 @@
         </w:trPr>
         <w:tc>
           <w:tcPr>
-            <w:tcW w:w="1814" w:type="dxa"/>
+            <w:tcW w:w="3402" w:type="dxa"/>
             <w:shd w:val="clear" w:color="auto" w:fill="E7E7E7"/>
             <w:tcMar>
               <w:top w:w="75" w:type="dxa"/>
@@ -5217,13 +5207,13 @@
               <w:rPr>
                 <w:b/>
               </w:rPr>
-              <w:t>Algoritma</w:t>
-            </w:r>
-          </w:p>
-        </w:tc>
-        <w:tc>
-          <w:tcPr>
-            <w:tcW w:w="1191" w:type="dxa"/>
+              <w:t>Parameter</w:t>
+            </w:r>
+          </w:p>
+        </w:tc>
+        <w:tc>
+          <w:tcPr>
+            <w:tcW w:w="4535" w:type="dxa"/>
             <w:shd w:val="clear" w:color="auto" w:fill="E7E7E7"/>
             <w:tcMar>
               <w:top w:w="75" w:type="dxa"/>
@@ -5243,111 +5233,7 @@
               <w:rPr>
                 <w:b/>
               </w:rPr>
-              <w:t>Accuracy</w:t>
-            </w:r>
-          </w:p>
-        </w:tc>
-        <w:tc>
-          <w:tcPr>
-            <w:tcW w:w="1191" w:type="dxa"/>
-            <w:shd w:val="clear" w:color="auto" w:fill="E7E7E7"/>
-            <w:tcMar>
-              <w:top w:w="75" w:type="dxa"/>
-              <w:left w:w="90" w:type="dxa"/>
-              <w:bottom w:w="75" w:type="dxa"/>
-              <w:right w:w="90" w:type="dxa"/>
-            </w:tcMar>
-            <w:vAlign w:val="center"/>
-          </w:tcPr>
-          <w:p>
-            <w:pPr>
-              <w:keepNext/>
-              <w:spacing w:after="60"/>
-              <w:jc w:val="center"/>
-            </w:pPr>
-            <w:r>
-              <w:rPr>
-                <w:b/>
-              </w:rPr>
-              <w:t>Precision</w:t>
-            </w:r>
-          </w:p>
-        </w:tc>
-        <w:tc>
-          <w:tcPr>
-            <w:tcW w:w="850" w:type="dxa"/>
-            <w:shd w:val="clear" w:color="auto" w:fill="E7E7E7"/>
-            <w:tcMar>
-              <w:top w:w="75" w:type="dxa"/>
-              <w:left w:w="90" w:type="dxa"/>
-              <w:bottom w:w="75" w:type="dxa"/>
-              <w:right w:w="90" w:type="dxa"/>
-            </w:tcMar>
-            <w:vAlign w:val="center"/>
-          </w:tcPr>
-          <w:p>
-            <w:pPr>
-              <w:keepNext/>
-              <w:spacing w:after="60"/>
-              <w:jc w:val="center"/>
-            </w:pPr>
-            <w:r>
-              <w:rPr>
-                <w:b/>
-              </w:rPr>
-              <w:t>Recall</w:t>
-            </w:r>
-          </w:p>
-        </w:tc>
-        <w:tc>
-          <w:tcPr>
-            <w:tcW w:w="850" w:type="dxa"/>
-            <w:shd w:val="clear" w:color="auto" w:fill="E7E7E7"/>
-            <w:tcMar>
-              <w:top w:w="75" w:type="dxa"/>
-              <w:left w:w="90" w:type="dxa"/>
-              <w:bottom w:w="75" w:type="dxa"/>
-              <w:right w:w="90" w:type="dxa"/>
-            </w:tcMar>
-            <w:vAlign w:val="center"/>
-          </w:tcPr>
-          <w:p>
-            <w:pPr>
-              <w:keepNext/>
-              <w:spacing w:after="60"/>
-              <w:jc w:val="center"/>
-            </w:pPr>
-            <w:r>
-              <w:rPr>
-                <w:b/>
-              </w:rPr>
-              <w:t>F1 score</w:t>
-            </w:r>
-          </w:p>
-        </w:tc>
-        <w:tc>
-          <w:tcPr>
-            <w:tcW w:w="2041" w:type="dxa"/>
-            <w:shd w:val="clear" w:color="auto" w:fill="E7E7E7"/>
-            <w:tcMar>
-              <w:top w:w="75" w:type="dxa"/>
-              <w:left w:w="90" w:type="dxa"/>
-              <w:bottom w:w="75" w:type="dxa"/>
-              <w:right w:w="90" w:type="dxa"/>
-            </w:tcMar>
-            <w:vAlign w:val="center"/>
-          </w:tcPr>
-          <w:p>
-            <w:pPr>
-              <w:keepNext/>
-              <w:spacing w:after="60"/>
-              <w:jc w:val="center"/>
-            </w:pPr>
-            <w:r>
-              <w:rPr>
-                <w:b/>
-              </w:rPr>
-              <w:t>Interpretability</w:t>
+              <w:t>Nilai pada implementasi</w:t>
             </w:r>
           </w:p>
         </w:tc>
@@ -5359,7 +5245,7 @@
         </w:trPr>
         <w:tc>
           <w:tcPr>
-            <w:tcW w:w="1814" w:type="dxa"/>
+            <w:tcW w:w="3402" w:type="dxa"/>
             <w:shd w:val="clear" w:color="auto" w:fill="FFFFFF"/>
             <w:tcMar>
               <w:top w:w="75" w:type="dxa"/>
@@ -5376,13 +5262,13 @@
               <w:jc w:val="left"/>
             </w:pPr>
             <w:r>
-              <w:t>K-Means</w:t>
-            </w:r>
-          </w:p>
-        </w:tc>
-        <w:tc>
-          <w:tcPr>
-            <w:tcW w:w="1191" w:type="dxa"/>
+              <w:t>Data pelatihan</w:t>
+            </w:r>
+          </w:p>
+        </w:tc>
+        <w:tc>
+          <w:tcPr>
+            <w:tcW w:w="4535" w:type="dxa"/>
             <w:shd w:val="clear" w:color="auto" w:fill="FFFFFF"/>
             <w:tcMar>
               <w:top w:w="75" w:type="dxa"/>
@@ -5399,99 +5285,7 @@
               <w:jc w:val="left"/>
             </w:pPr>
             <w:r>
-              <w:t>N/A</w:t>
-            </w:r>
-          </w:p>
-        </w:tc>
-        <w:tc>
-          <w:tcPr>
-            <w:tcW w:w="1191" w:type="dxa"/>
-            <w:shd w:val="clear" w:color="auto" w:fill="FFFFFF"/>
-            <w:tcMar>
-              <w:top w:w="75" w:type="dxa"/>
-              <w:left w:w="90" w:type="dxa"/>
-              <w:bottom w:w="75" w:type="dxa"/>
-              <w:right w:w="90" w:type="dxa"/>
-            </w:tcMar>
-            <w:vAlign w:val="center"/>
-          </w:tcPr>
-          <w:p>
-            <w:pPr>
-              <w:keepNext/>
-              <w:spacing w:after="60"/>
-              <w:jc w:val="left"/>
-            </w:pPr>
-            <w:r>
-              <w:t>N/A</w:t>
-            </w:r>
-          </w:p>
-        </w:tc>
-        <w:tc>
-          <w:tcPr>
-            <w:tcW w:w="850" w:type="dxa"/>
-            <w:shd w:val="clear" w:color="auto" w:fill="FFFFFF"/>
-            <w:tcMar>
-              <w:top w:w="75" w:type="dxa"/>
-              <w:left w:w="90" w:type="dxa"/>
-              <w:bottom w:w="75" w:type="dxa"/>
-              <w:right w:w="90" w:type="dxa"/>
-            </w:tcMar>
-            <w:vAlign w:val="center"/>
-          </w:tcPr>
-          <w:p>
-            <w:pPr>
-              <w:keepNext/>
-              <w:spacing w:after="60"/>
-              <w:jc w:val="left"/>
-            </w:pPr>
-            <w:r>
-              <w:t>N/A</w:t>
-            </w:r>
-          </w:p>
-        </w:tc>
-        <w:tc>
-          <w:tcPr>
-            <w:tcW w:w="850" w:type="dxa"/>
-            <w:shd w:val="clear" w:color="auto" w:fill="FFFFFF"/>
-            <w:tcMar>
-              <w:top w:w="75" w:type="dxa"/>
-              <w:left w:w="90" w:type="dxa"/>
-              <w:bottom w:w="75" w:type="dxa"/>
-              <w:right w:w="90" w:type="dxa"/>
-            </w:tcMar>
-            <w:vAlign w:val="center"/>
-          </w:tcPr>
-          <w:p>
-            <w:pPr>
-              <w:keepNext/>
-              <w:spacing w:after="60"/>
-              <w:jc w:val="left"/>
-            </w:pPr>
-            <w:r>
-              <w:t>N/A</w:t>
-            </w:r>
-          </w:p>
-        </w:tc>
-        <w:tc>
-          <w:tcPr>
-            <w:tcW w:w="2041" w:type="dxa"/>
-            <w:shd w:val="clear" w:color="auto" w:fill="FFFFFF"/>
-            <w:tcMar>
-              <w:top w:w="75" w:type="dxa"/>
-              <w:left w:w="90" w:type="dxa"/>
-              <w:bottom w:w="75" w:type="dxa"/>
-              <w:right w:w="90" w:type="dxa"/>
-            </w:tcMar>
-            <w:vAlign w:val="center"/>
-          </w:tcPr>
-          <w:p>
-            <w:pPr>
-              <w:keepNext/>
-              <w:spacing w:after="60"/>
-              <w:jc w:val="left"/>
-            </w:pPr>
-            <w:r>
-              <w:t>Centroid mudah dijelaskan</w:t>
+              <w:t>Seluruh 443 destinasi</w:t>
             </w:r>
           </w:p>
         </w:tc>
@@ -5503,7 +5297,7 @@
         </w:trPr>
         <w:tc>
           <w:tcPr>
-            <w:tcW w:w="1814" w:type="dxa"/>
+            <w:tcW w:w="3402" w:type="dxa"/>
             <w:shd w:val="clear" w:color="auto" w:fill="FFFFFF"/>
             <w:tcMar>
               <w:top w:w="75" w:type="dxa"/>
@@ -5520,13 +5314,13 @@
               <w:jc w:val="left"/>
             </w:pPr>
             <w:r>
-              <w:t>Agglomerative clustering</w:t>
-            </w:r>
-          </w:p>
-        </w:tc>
-        <w:tc>
-          <w:tcPr>
-            <w:tcW w:w="1191" w:type="dxa"/>
+              <w:t>Jumlah fitur</w:t>
+            </w:r>
+          </w:p>
+        </w:tc>
+        <w:tc>
+          <w:tcPr>
+            <w:tcW w:w="4535" w:type="dxa"/>
             <w:shd w:val="clear" w:color="auto" w:fill="FFFFFF"/>
             <w:tcMar>
               <w:top w:w="75" w:type="dxa"/>
@@ -5543,99 +5337,7 @@
               <w:jc w:val="left"/>
             </w:pPr>
             <w:r>
-              <w:t>N/A</w:t>
-            </w:r>
-          </w:p>
-        </w:tc>
-        <w:tc>
-          <w:tcPr>
-            <w:tcW w:w="1191" w:type="dxa"/>
-            <w:shd w:val="clear" w:color="auto" w:fill="FFFFFF"/>
-            <w:tcMar>
-              <w:top w:w="75" w:type="dxa"/>
-              <w:left w:w="90" w:type="dxa"/>
-              <w:bottom w:w="75" w:type="dxa"/>
-              <w:right w:w="90" w:type="dxa"/>
-            </w:tcMar>
-            <w:vAlign w:val="center"/>
-          </w:tcPr>
-          <w:p>
-            <w:pPr>
-              <w:keepNext/>
-              <w:spacing w:after="60"/>
-              <w:jc w:val="left"/>
-            </w:pPr>
-            <w:r>
-              <w:t>N/A</w:t>
-            </w:r>
-          </w:p>
-        </w:tc>
-        <w:tc>
-          <w:tcPr>
-            <w:tcW w:w="850" w:type="dxa"/>
-            <w:shd w:val="clear" w:color="auto" w:fill="FFFFFF"/>
-            <w:tcMar>
-              <w:top w:w="75" w:type="dxa"/>
-              <w:left w:w="90" w:type="dxa"/>
-              <w:bottom w:w="75" w:type="dxa"/>
-              <w:right w:w="90" w:type="dxa"/>
-            </w:tcMar>
-            <w:vAlign w:val="center"/>
-          </w:tcPr>
-          <w:p>
-            <w:pPr>
-              <w:keepNext/>
-              <w:spacing w:after="60"/>
-              <w:jc w:val="left"/>
-            </w:pPr>
-            <w:r>
-              <w:t>N/A</w:t>
-            </w:r>
-          </w:p>
-        </w:tc>
-        <w:tc>
-          <w:tcPr>
-            <w:tcW w:w="850" w:type="dxa"/>
-            <w:shd w:val="clear" w:color="auto" w:fill="FFFFFF"/>
-            <w:tcMar>
-              <w:top w:w="75" w:type="dxa"/>
-              <w:left w:w="90" w:type="dxa"/>
-              <w:bottom w:w="75" w:type="dxa"/>
-              <w:right w:w="90" w:type="dxa"/>
-            </w:tcMar>
-            <w:vAlign w:val="center"/>
-          </w:tcPr>
-          <w:p>
-            <w:pPr>
-              <w:keepNext/>
-              <w:spacing w:after="60"/>
-              <w:jc w:val="left"/>
-            </w:pPr>
-            <w:r>
-              <w:t>N/A</w:t>
-            </w:r>
-          </w:p>
-        </w:tc>
-        <w:tc>
-          <w:tcPr>
-            <w:tcW w:w="2041" w:type="dxa"/>
-            <w:shd w:val="clear" w:color="auto" w:fill="FFFFFF"/>
-            <w:tcMar>
-              <w:top w:w="75" w:type="dxa"/>
-              <w:left w:w="90" w:type="dxa"/>
-              <w:bottom w:w="75" w:type="dxa"/>
-              <w:right w:w="90" w:type="dxa"/>
-            </w:tcMar>
-            <w:vAlign w:val="center"/>
-          </w:tcPr>
-          <w:p>
-            <w:pPr>
-              <w:keepNext/>
-              <w:spacing w:after="60"/>
-              <w:jc w:val="left"/>
-            </w:pPr>
-            <w:r>
-              <w:t>Dendrogram kelompok</w:t>
+              <w:t>8 fitur numerik hasil transformasi</w:t>
             </w:r>
           </w:p>
         </w:tc>
@@ -5647,139 +5349,45 @@
         </w:trPr>
         <w:tc>
           <w:tcPr>
-            <w:tcW w:w="1814" w:type="dxa"/>
-            <w:shd w:val="clear" w:color="auto" w:fill="FFFFFF"/>
-            <w:tcMar>
-              <w:top w:w="75" w:type="dxa"/>
-              <w:left w:w="90" w:type="dxa"/>
-              <w:bottom w:w="75" w:type="dxa"/>
-              <w:right w:w="90" w:type="dxa"/>
-            </w:tcMar>
-            <w:vAlign w:val="center"/>
-          </w:tcPr>
-          <w:p>
-            <w:pPr>
-              <w:keepNext/>
+            <w:tcW w:w="3402" w:type="dxa"/>
+            <w:shd w:val="clear" w:color="auto" w:fill="FFFFFF"/>
+            <w:tcMar>
+              <w:top w:w="75" w:type="dxa"/>
+              <w:left w:w="90" w:type="dxa"/>
+              <w:bottom w:w="75" w:type="dxa"/>
+              <w:right w:w="90" w:type="dxa"/>
+            </w:tcMar>
+            <w:vAlign w:val="center"/>
+          </w:tcPr>
+          <w:p>
+            <w:pPr>
               <w:spacing w:after="60"/>
               <w:jc w:val="left"/>
             </w:pPr>
             <w:r>
-              <w:t>DBSCAN</w:t>
-            </w:r>
-          </w:p>
-        </w:tc>
-        <w:tc>
-          <w:tcPr>
-            <w:tcW w:w="1191" w:type="dxa"/>
-            <w:shd w:val="clear" w:color="auto" w:fill="FFFFFF"/>
-            <w:tcMar>
-              <w:top w:w="75" w:type="dxa"/>
-              <w:left w:w="90" w:type="dxa"/>
-              <w:bottom w:w="75" w:type="dxa"/>
-              <w:right w:w="90" w:type="dxa"/>
-            </w:tcMar>
-            <w:vAlign w:val="center"/>
-          </w:tcPr>
-          <w:p>
-            <w:pPr>
-              <w:keepNext/>
+              <w:t>Inisialisasi centroid</w:t>
+            </w:r>
+          </w:p>
+        </w:tc>
+        <w:tc>
+          <w:tcPr>
+            <w:tcW w:w="4535" w:type="dxa"/>
+            <w:shd w:val="clear" w:color="auto" w:fill="FFFFFF"/>
+            <w:tcMar>
+              <w:top w:w="75" w:type="dxa"/>
+              <w:left w:w="90" w:type="dxa"/>
+              <w:bottom w:w="75" w:type="dxa"/>
+              <w:right w:w="90" w:type="dxa"/>
+            </w:tcMar>
+            <w:vAlign w:val="center"/>
+          </w:tcPr>
+          <w:p>
+            <w:pPr>
               <w:spacing w:after="60"/>
               <w:jc w:val="left"/>
             </w:pPr>
             <w:r>
-              <w:t>N/A</w:t>
-            </w:r>
-          </w:p>
-        </w:tc>
-        <w:tc>
-          <w:tcPr>
-            <w:tcW w:w="1191" w:type="dxa"/>
-            <w:shd w:val="clear" w:color="auto" w:fill="FFFFFF"/>
-            <w:tcMar>
-              <w:top w:w="75" w:type="dxa"/>
-              <w:left w:w="90" w:type="dxa"/>
-              <w:bottom w:w="75" w:type="dxa"/>
-              <w:right w:w="90" w:type="dxa"/>
-            </w:tcMar>
-            <w:vAlign w:val="center"/>
-          </w:tcPr>
-          <w:p>
-            <w:pPr>
-              <w:keepNext/>
-              <w:spacing w:after="60"/>
-              <w:jc w:val="left"/>
-            </w:pPr>
-            <w:r>
-              <w:t>N/A</w:t>
-            </w:r>
-          </w:p>
-        </w:tc>
-        <w:tc>
-          <w:tcPr>
-            <w:tcW w:w="850" w:type="dxa"/>
-            <w:shd w:val="clear" w:color="auto" w:fill="FFFFFF"/>
-            <w:tcMar>
-              <w:top w:w="75" w:type="dxa"/>
-              <w:left w:w="90" w:type="dxa"/>
-              <w:bottom w:w="75" w:type="dxa"/>
-              <w:right w:w="90" w:type="dxa"/>
-            </w:tcMar>
-            <w:vAlign w:val="center"/>
-          </w:tcPr>
-          <w:p>
-            <w:pPr>
-              <w:keepNext/>
-              <w:spacing w:after="60"/>
-              <w:jc w:val="left"/>
-            </w:pPr>
-            <w:r>
-              <w:t>N/A</w:t>
-            </w:r>
-          </w:p>
-        </w:tc>
-        <w:tc>
-          <w:tcPr>
-            <w:tcW w:w="850" w:type="dxa"/>
-            <w:shd w:val="clear" w:color="auto" w:fill="FFFFFF"/>
-            <w:tcMar>
-              <w:top w:w="75" w:type="dxa"/>
-              <w:left w:w="90" w:type="dxa"/>
-              <w:bottom w:w="75" w:type="dxa"/>
-              <w:right w:w="90" w:type="dxa"/>
-            </w:tcMar>
-            <w:vAlign w:val="center"/>
-          </w:tcPr>
-          <w:p>
-            <w:pPr>
-              <w:keepNext/>
-              <w:spacing w:after="60"/>
-              <w:jc w:val="left"/>
-            </w:pPr>
-            <w:r>
-              <w:t>N/A</w:t>
-            </w:r>
-          </w:p>
-        </w:tc>
-        <w:tc>
-          <w:tcPr>
-            <w:tcW w:w="2041" w:type="dxa"/>
-            <w:shd w:val="clear" w:color="auto" w:fill="FFFFFF"/>
-            <w:tcMar>
-              <w:top w:w="75" w:type="dxa"/>
-              <w:left w:w="90" w:type="dxa"/>
-              <w:bottom w:w="75" w:type="dxa"/>
-              <w:right w:w="90" w:type="dxa"/>
-            </w:tcMar>
-            <w:vAlign w:val="center"/>
-          </w:tcPr>
-          <w:p>
-            <w:pPr>
-              <w:keepNext/>
-              <w:spacing w:after="60"/>
-              <w:jc w:val="left"/>
-            </w:pPr>
-            <w:r>
-              <w:t>Noise dan kepadatan</w:t>
+              <w:t>k-means++</w:t>
             </w:r>
           </w:p>
         </w:tc>
@@ -5791,139 +5399,45 @@
         </w:trPr>
         <w:tc>
           <w:tcPr>
-            <w:tcW w:w="1814" w:type="dxa"/>
-            <w:shd w:val="clear" w:color="auto" w:fill="FFFFFF"/>
-            <w:tcMar>
-              <w:top w:w="75" w:type="dxa"/>
-              <w:left w:w="90" w:type="dxa"/>
-              <w:bottom w:w="75" w:type="dxa"/>
-              <w:right w:w="90" w:type="dxa"/>
-            </w:tcMar>
-            <w:vAlign w:val="center"/>
-          </w:tcPr>
-          <w:p>
-            <w:pPr>
-              <w:keepNext/>
+            <w:tcW w:w="3402" w:type="dxa"/>
+            <w:shd w:val="clear" w:color="auto" w:fill="FFFFFF"/>
+            <w:tcMar>
+              <w:top w:w="75" w:type="dxa"/>
+              <w:left w:w="90" w:type="dxa"/>
+              <w:bottom w:w="75" w:type="dxa"/>
+              <w:right w:w="90" w:type="dxa"/>
+            </w:tcMar>
+            <w:vAlign w:val="center"/>
+          </w:tcPr>
+          <w:p>
+            <w:pPr>
               <w:spacing w:after="60"/>
               <w:jc w:val="left"/>
             </w:pPr>
             <w:r>
-              <w:t>Decision Tree</w:t>
-            </w:r>
-          </w:p>
-        </w:tc>
-        <w:tc>
-          <w:tcPr>
-            <w:tcW w:w="1191" w:type="dxa"/>
-            <w:shd w:val="clear" w:color="auto" w:fill="FFFFFF"/>
-            <w:tcMar>
-              <w:top w:w="75" w:type="dxa"/>
-              <w:left w:w="90" w:type="dxa"/>
-              <w:bottom w:w="75" w:type="dxa"/>
-              <w:right w:w="90" w:type="dxa"/>
-            </w:tcMar>
-            <w:vAlign w:val="center"/>
-          </w:tcPr>
-          <w:p>
-            <w:pPr>
-              <w:keepNext/>
+              <w:t>Jumlah inisialisasi</w:t>
+            </w:r>
+          </w:p>
+        </w:tc>
+        <w:tc>
+          <w:tcPr>
+            <w:tcW w:w="4535" w:type="dxa"/>
+            <w:shd w:val="clear" w:color="auto" w:fill="FFFFFF"/>
+            <w:tcMar>
+              <w:top w:w="75" w:type="dxa"/>
+              <w:left w:w="90" w:type="dxa"/>
+              <w:bottom w:w="75" w:type="dxa"/>
+              <w:right w:w="90" w:type="dxa"/>
+            </w:tcMar>
+            <w:vAlign w:val="center"/>
+          </w:tcPr>
+          <w:p>
+            <w:pPr>
               <w:spacing w:after="60"/>
               <w:jc w:val="left"/>
             </w:pPr>
             <w:r>
-              <w:t>Belum diuji</w:t>
-            </w:r>
-          </w:p>
-        </w:tc>
-        <w:tc>
-          <w:tcPr>
-            <w:tcW w:w="1191" w:type="dxa"/>
-            <w:shd w:val="clear" w:color="auto" w:fill="FFFFFF"/>
-            <w:tcMar>
-              <w:top w:w="75" w:type="dxa"/>
-              <w:left w:w="90" w:type="dxa"/>
-              <w:bottom w:w="75" w:type="dxa"/>
-              <w:right w:w="90" w:type="dxa"/>
-            </w:tcMar>
-            <w:vAlign w:val="center"/>
-          </w:tcPr>
-          <w:p>
-            <w:pPr>
-              <w:keepNext/>
-              <w:spacing w:after="60"/>
-              <w:jc w:val="left"/>
-            </w:pPr>
-            <w:r>
-              <w:t>Belum diuji</w:t>
-            </w:r>
-          </w:p>
-        </w:tc>
-        <w:tc>
-          <w:tcPr>
-            <w:tcW w:w="850" w:type="dxa"/>
-            <w:shd w:val="clear" w:color="auto" w:fill="FFFFFF"/>
-            <w:tcMar>
-              <w:top w:w="75" w:type="dxa"/>
-              <w:left w:w="90" w:type="dxa"/>
-              <w:bottom w:w="75" w:type="dxa"/>
-              <w:right w:w="90" w:type="dxa"/>
-            </w:tcMar>
-            <w:vAlign w:val="center"/>
-          </w:tcPr>
-          <w:p>
-            <w:pPr>
-              <w:keepNext/>
-              <w:spacing w:after="60"/>
-              <w:jc w:val="left"/>
-            </w:pPr>
-            <w:r>
-              <w:t>Belum diuji</w:t>
-            </w:r>
-          </w:p>
-        </w:tc>
-        <w:tc>
-          <w:tcPr>
-            <w:tcW w:w="850" w:type="dxa"/>
-            <w:shd w:val="clear" w:color="auto" w:fill="FFFFFF"/>
-            <w:tcMar>
-              <w:top w:w="75" w:type="dxa"/>
-              <w:left w:w="90" w:type="dxa"/>
-              <w:bottom w:w="75" w:type="dxa"/>
-              <w:right w:w="90" w:type="dxa"/>
-            </w:tcMar>
-            <w:vAlign w:val="center"/>
-          </w:tcPr>
-          <w:p>
-            <w:pPr>
-              <w:keepNext/>
-              <w:spacing w:after="60"/>
-              <w:jc w:val="left"/>
-            </w:pPr>
-            <w:r>
-              <w:t>Belum diuji</w:t>
-            </w:r>
-          </w:p>
-        </w:tc>
-        <w:tc>
-          <w:tcPr>
-            <w:tcW w:w="2041" w:type="dxa"/>
-            <w:shd w:val="clear" w:color="auto" w:fill="FFFFFF"/>
-            <w:tcMar>
-              <w:top w:w="75" w:type="dxa"/>
-              <w:left w:w="90" w:type="dxa"/>
-              <w:bottom w:w="75" w:type="dxa"/>
-              <w:right w:w="90" w:type="dxa"/>
-            </w:tcMar>
-            <w:vAlign w:val="center"/>
-          </w:tcPr>
-          <w:p>
-            <w:pPr>
-              <w:keepNext/>
-              <w:spacing w:after="60"/>
-              <w:jc w:val="left"/>
-            </w:pPr>
-            <w:r>
-              <w:t>Aturan pohon</w:t>
+              <w:t>10</w:t>
             </w:r>
           </w:p>
         </w:tc>
@@ -5935,7 +5449,7 @@
         </w:trPr>
         <w:tc>
           <w:tcPr>
-            <w:tcW w:w="1814" w:type="dxa"/>
+            <w:tcW w:w="3402" w:type="dxa"/>
             <w:shd w:val="clear" w:color="auto" w:fill="FFFFFF"/>
             <w:tcMar>
               <w:top w:w="75" w:type="dxa"/>
@@ -5951,13 +5465,13 @@
               <w:jc w:val="left"/>
             </w:pPr>
             <w:r>
-              <w:t>Random Forest</w:t>
-            </w:r>
-          </w:p>
-        </w:tc>
-        <w:tc>
-          <w:tcPr>
-            <w:tcW w:w="1191" w:type="dxa"/>
+              <w:t>Seed</w:t>
+            </w:r>
+          </w:p>
+        </w:tc>
+        <w:tc>
+          <w:tcPr>
+            <w:tcW w:w="4535" w:type="dxa"/>
             <w:shd w:val="clear" w:color="auto" w:fill="FFFFFF"/>
             <w:tcMar>
               <w:top w:w="75" w:type="dxa"/>
@@ -5973,13 +5487,19 @@
               <w:jc w:val="left"/>
             </w:pPr>
             <w:r>
-              <w:t>Belum diuji</w:t>
-            </w:r>
-          </w:p>
-        </w:tc>
-        <w:tc>
-          <w:tcPr>
-            <w:tcW w:w="1191" w:type="dxa"/>
+              <w:t>42</w:t>
+            </w:r>
+          </w:p>
+        </w:tc>
+      </w:tr>
+      <w:tr>
+        <w:trPr>
+          <w:cantSplit/>
+          <w:jc w:val="center"/>
+        </w:trPr>
+        <w:tc>
+          <w:tcPr>
+            <w:tcW w:w="3402" w:type="dxa"/>
             <w:shd w:val="clear" w:color="auto" w:fill="FFFFFF"/>
             <w:tcMar>
               <w:top w:w="75" w:type="dxa"/>
@@ -5995,13 +5515,13 @@
               <w:jc w:val="left"/>
             </w:pPr>
             <w:r>
-              <w:t>Belum diuji</w:t>
-            </w:r>
-          </w:p>
-        </w:tc>
-        <w:tc>
-          <w:tcPr>
-            <w:tcW w:w="850" w:type="dxa"/>
+              <w:t>Kandidat jumlah cluster</w:t>
+            </w:r>
+          </w:p>
+        </w:tc>
+        <w:tc>
+          <w:tcPr>
+            <w:tcW w:w="4535" w:type="dxa"/>
             <w:shd w:val="clear" w:color="auto" w:fill="FFFFFF"/>
             <w:tcMar>
               <w:top w:w="75" w:type="dxa"/>
@@ -6017,13 +5537,19 @@
               <w:jc w:val="left"/>
             </w:pPr>
             <w:r>
-              <w:t>Belum diuji</w:t>
-            </w:r>
-          </w:p>
-        </w:tc>
-        <w:tc>
-          <w:tcPr>
-            <w:tcW w:w="850" w:type="dxa"/>
+              <w:t>k = 2 sampai 6</w:t>
+            </w:r>
+          </w:p>
+        </w:tc>
+      </w:tr>
+      <w:tr>
+        <w:trPr>
+          <w:cantSplit/>
+          <w:jc w:val="center"/>
+        </w:trPr>
+        <w:tc>
+          <w:tcPr>
+            <w:tcW w:w="3402" w:type="dxa"/>
             <w:shd w:val="clear" w:color="auto" w:fill="FFFFFF"/>
             <w:tcMar>
               <w:top w:w="75" w:type="dxa"/>
@@ -6039,13 +5565,13 @@
               <w:jc w:val="left"/>
             </w:pPr>
             <w:r>
-              <w:t>Belum diuji</w:t>
-            </w:r>
-          </w:p>
-        </w:tc>
-        <w:tc>
-          <w:tcPr>
-            <w:tcW w:w="2041" w:type="dxa"/>
+              <w:t>Maksimal iterasi</w:t>
+            </w:r>
+          </w:p>
+        </w:tc>
+        <w:tc>
+          <w:tcPr>
+            <w:tcW w:w="4535" w:type="dxa"/>
             <w:shd w:val="clear" w:color="auto" w:fill="FFFFFF"/>
             <w:tcMar>
               <w:top w:w="75" w:type="dxa"/>
@@ -6061,7 +5587,57 @@
               <w:jc w:val="left"/>
             </w:pPr>
             <w:r>
-              <w:t>Gabungan banyak pohon</w:t>
+              <w:t>100</w:t>
+            </w:r>
+          </w:p>
+        </w:tc>
+      </w:tr>
+      <w:tr>
+        <w:trPr>
+          <w:cantSplit/>
+          <w:jc w:val="center"/>
+        </w:trPr>
+        <w:tc>
+          <w:tcPr>
+            <w:tcW w:w="3402" w:type="dxa"/>
+            <w:shd w:val="clear" w:color="auto" w:fill="FFFFFF"/>
+            <w:tcMar>
+              <w:top w:w="75" w:type="dxa"/>
+              <w:left w:w="90" w:type="dxa"/>
+              <w:bottom w:w="75" w:type="dxa"/>
+              <w:right w:w="90" w:type="dxa"/>
+            </w:tcMar>
+            <w:vAlign w:val="center"/>
+          </w:tcPr>
+          <w:p>
+            <w:pPr>
+              <w:spacing w:after="60"/>
+              <w:jc w:val="left"/>
+            </w:pPr>
+            <w:r>
+              <w:t>Toleransi perpindahan centroid</w:t>
+            </w:r>
+          </w:p>
+        </w:tc>
+        <w:tc>
+          <w:tcPr>
+            <w:tcW w:w="4535" w:type="dxa"/>
+            <w:shd w:val="clear" w:color="auto" w:fill="FFFFFF"/>
+            <w:tcMar>
+              <w:top w:w="75" w:type="dxa"/>
+              <w:left w:w="90" w:type="dxa"/>
+              <w:bottom w:w="75" w:type="dxa"/>
+              <w:right w:w="90" w:type="dxa"/>
+            </w:tcMar>
+            <w:vAlign w:val="center"/>
+          </w:tcPr>
+          <w:p>
+            <w:pPr>
+              <w:spacing w:after="60"/>
+              <w:jc w:val="left"/>
+            </w:pPr>
+            <w:r>
+              <w:t>0,000001</w:t>
             </w:r>
           </w:p>
         </w:tc>
@@ -6074,17 +5650,14 @@
     </w:p>
     <w:p>
       <w:r>
-        <w:t>K-Means dipilih karena sesuai dengan tujuan segmentasi tanpa label, tersedia pada codebase, dan menghasilkan centroid yang mudah dijelaskan. Agglomerative dan DBSCAN belum mempunyai hasil benchmark pada dataset aktif sehingga tidak dinyatakan lebih buruk secara numerik. K-Means juga memiliki keterbatasan: sensitif terhadap skala dan pencilan, serta cenderung sesuai untuk kelompok dengan bentuk tertentu. Penilaian pilihan metode harus mempertimbangkan keterbatasan tersebut, bukan hanya kemudahan implementasi</w:t>
-      </w:r>
-      <w:r>
-        <w:t>.</w:t>
+        <w:t>K-Means sensitif terhadap skala dan pencilan. Standardisasi menyamakan skala fitur, sedangkan pembatasan harga pada P99 mengurangi pengaruh harga ekstrem pada pelatihan. Nilai harga sumber tetap dipertahankan untuk perhitungan SPK. Centroid dan label segmen merupakan ringkasan data, bukan penilaian bahwa semua anggota cluster memiliki kualitas yang sama.</w:t>
       </w:r>
     </w:p>
     <w:p>
       <w:pPr>
         <w:pStyle w:val="Heading2"/>
       </w:pPr>
-      <w:bookmarkStart w:id="14" w:name="_Toc242111086"/>
+      <w:bookmarkStart w:id="14" w:name="_Toc242114653"/>
       <w:r>
         <w:t>2 5 Hasil Evaluasi K Means pada Snapshot Aktif</w:t>
       </w:r>
@@ -6092,7 +5665,7 @@
     </w:p>
     <w:p>
       <w:r>
-        <w:t>Implementasi K-Means memakai NumPy dengan inisialisasi k-means++, sepuluh titik awal, seed 42, maksimal 100 iterasi, serta toleransi perpindahan centroid 0,000001. Sistem mencoba k dari 2 sampai 6. Ukuran minimum cluster ditetapkan 22 anggota berdasarkan maksimum antara 5 dan pembulatan 5% dari 443. Semua kandidat pada laporan memenuhi batas tersebut. Konfigurasi terpilih adalah yang mempunyai silhouette terbesar di antara konfigurasi yang layak.</w:t>
+        <w:t>Implementasi K-Means memakai NumPy dengan konfigurasi pada Tabel 5. Ukuran minimum cluster ditetapkan 22 anggota berdasarkan maksimum antara 5 dan pembulatan 5% dari 443. Semua kandidat pada laporan memenuhi batas tersebut. Konfigurasi terpilih adalah yang mempunyai silhouette terbesar di antara konfigurasi yang layak.</w:t>
       </w:r>
     </w:p>
     <w:p>
@@ -7077,14 +6650,14 @@
     </w:p>
     <w:p>
       <w:r>
-        <w:t>Seluruh 443 destinasi mendapatkan label hasil pelatihan, termasuk keenam tambahan. Silhouette dihitung pada data pelatihan yang sama dan memberi evaluasi internal bentuk kelompok. Tidak ada klaim train-test accuracy, precision, recall, atau F1-score. Keberhasilan clustering tidak otomatis menunjukkan bahwa urutan rekomendasi telah sesuai penilaian pengguna.</w:t>
+        <w:t>Seluruh 443 destinasi mendapatkan label hasil pelatihan, termasuk keenam tambahan. Silhouette dihitung pada data pelatihan yang sama dan memberi evaluasi internal bentuk kelompok. Hasil pengelompokan menjelaskan kemiripan destinasi; urutan rekomendasi dihitung secara terpisah menggunakan TOPSIS.</w:t>
       </w:r>
     </w:p>
     <w:p>
       <w:pPr>
         <w:pStyle w:val="Heading2"/>
       </w:pPr>
-      <w:bookmarkStart w:id="15" w:name="_Toc242111087"/>
+      <w:bookmarkStart w:id="15" w:name="_Toc242114654"/>
       <w:r>
         <w:t>2 6 Alternatif Tindakan</w:t>
       </w:r>
@@ -7092,11 +6665,7 @@
     </w:p>
     <w:p>
       <w:r>
-        <w:t xml:space="preserve">Alternatif tindakan A1, A2, A3, dan seterusnya adalah keputusan untuk mengunjungi destinasi tertentu yang lolos filter pada satu permintaan. A1 bukan nama tetap satu destinasi untuk semua pengguna. Jumlah alternatif berubah </w:t>
-      </w:r>
-      <w:r>
-        <w:lastRenderedPageBreak/>
-        <w:t>mengikuti provinsi dan budget. ID sumber tetap disimpan agar hasil tidak tertukar ketika urutan ranking berubah.</w:t>
+        <w:t>Alternatif tindakan A1, A2, A3, dan seterusnya adalah keputusan untuk mengunjungi destinasi tertentu yang lolos filter pada satu permintaan. A1 bukan nama tetap satu destinasi untuk semua pengguna. Jumlah alternatif berubah mengikuti provinsi dan budget. ID sumber tetap disimpan agar hasil tidak tertukar ketika urutan ranking berubah.</w:t>
       </w:r>
     </w:p>
     <w:p>
@@ -7106,6 +6675,7 @@
         <w:jc w:val="left"/>
       </w:pPr>
       <w:r>
+        <w:lastRenderedPageBreak/>
         <w:t>Tabel 8 Contoh alternatif yang berasal dari data aktif</w:t>
       </w:r>
     </w:p>
@@ -7840,9 +7410,8 @@
       <w:pPr>
         <w:pStyle w:val="Heading2"/>
       </w:pPr>
-      <w:bookmarkStart w:id="16" w:name="_Toc242111088"/>
+      <w:bookmarkStart w:id="16" w:name="_Toc242114655"/>
       <w:r>
-        <w:lastRenderedPageBreak/>
         <w:t>2 7 Kriteria dan Jenis Cost atau Benefit</w:t>
       </w:r>
       <w:bookmarkEnd w:id="16"/>
@@ -8581,6 +8150,7 @@
     </w:p>
     <w:p>
       <w:r>
+        <w:lastRenderedPageBreak/>
         <w:t>Kriteria cost mengutamakan nilai lebih kecil, sedangkan benefit mengutamakan nilai lebih besar. Jika kategori utama dan sekunder sama, kondisi utama diperiksa lebih dulu sehingga nilainya 1. Jika hobi tidak dipilih, website menetapkan seluruh C6 menjadi 0, bukan menganggap pengguna cocok sempurna dengan semua destinasi.</w:t>
       </w:r>
     </w:p>
@@ -8724,7 +8294,7 @@
       <w:pPr>
         <w:pStyle w:val="Heading2"/>
       </w:pPr>
-      <w:bookmarkStart w:id="17" w:name="_Toc242111089"/>
+      <w:bookmarkStart w:id="17" w:name="_Toc242114656"/>
       <w:r>
         <w:t>2 8 Model Budget Tiket dan Jarak</w:t>
       </w:r>
@@ -8732,11 +8302,7 @@
     </w:p>
     <w:p>
       <w:r>
-        <w:t xml:space="preserve">Budget adalah batas tiket masuk satu destinasi per orang. Tidak ada kewajiban menghabiskan batas tersebut. Tiket gratis tetap dapat menjadi alternatif terbaik </w:t>
-      </w:r>
-      <w:r>
-        <w:lastRenderedPageBreak/>
-        <w:t>meskipun budget besar. Sisa alokasi tiket bukan sisa uang perjalanan karena transportasi, makan dan penginapan tidak dihitung.</w:t>
+        <w:t>Budget adalah batas tiket masuk satu destinasi per orang. Tidak ada kewajiban menghabiskan batas tersebut. Tiket gratis tetap dapat menjadi alternatif terbaik meskipun budget besar. Sisa alokasi tiket bukan sisa uang perjalanan karena transportasi, makan dan penginapan tidak dihitung.</w:t>
       </w:r>
     </w:p>
     <w:p>
@@ -9345,19 +8911,15 @@
     </w:p>
     <w:p>
       <w:r>
+        <w:lastRenderedPageBreak/>
         <w:t>Perubahan ini menghilangkan kebutuhan koefisien ongkos yang belum terkalibrasi. Nilai harga sumber tetap perlu diaudit bila merupakan paket, bukan tiket masuk murni. Koordinat kota asal adalah titik representatif, bukan lokasi pengguna yang presisi (Kelompok TravelFit, 2026c).</w:t>
-      </w:r>
-    </w:p>
-    <w:p>
-      <w:r>
-        <w:t>Pengelompokan pengalaman tematik, budaya/kota, dan alam/bahari masih merupakan rencana. Mapping kategori saja adalah aturan klasifikasi, bukan ontology formal dengan reasoner. Bila diterapkan, kelompok harus mengambil hasil ranking global yang sama agar skor tetap sebanding. Sistem saat ini tidak melakukan optimasi itinerary multi-destinasi.</w:t>
       </w:r>
     </w:p>
     <w:p>
       <w:pPr>
         <w:pStyle w:val="Heading2"/>
       </w:pPr>
-      <w:bookmarkStart w:id="18" w:name="_Toc242111090"/>
+      <w:bookmarkStart w:id="18" w:name="_Toc242114657"/>
       <w:r>
         <w:t>2 9 Dasar Bobot dan Pemilihan MCDM</w:t>
       </w:r>
@@ -9370,7 +8932,6 @@
     </w:p>
     <w:p>
       <w:r>
-        <w:lastRenderedPageBreak/>
         <w:t>Empat profil aktif merupakan preset rancangan pengembang. Bobot Seimbang mengikuti spreadsheet contoh awal dan profil lainnya mengikuti matriks yang ditulis pada profiles.py. CR yang kecil menunjukkan konsistensi internal matriks, bukan bukti bahwa bobot telah mewakili populasi wisatawan. Survei preferensi belum menjadi input bobot aktif.</w:t>
       </w:r>
     </w:p>
@@ -10726,6 +10287,7 @@
     </w:p>
     <w:p>
       <w:r>
+        <w:lastRenderedPageBreak/>
         <w:t>Slider pada website menormalisasi enam nilai nonnegatif agar jumlah bobot menjadi 1. Ketika slider diubah pengguna, bobot tersebut merupakan bobot langsung kustom, bukan AHP baru. Tidak ada matriks perbandingan baru atau CR baru untuk slider. Jika semua nilai slider nol, aplikasi kembali memakai bobot profil yang dipilih.</w:t>
       </w:r>
     </w:p>
@@ -10736,8 +10298,7 @@
         <w:jc w:val="left"/>
       </w:pPr>
       <w:r>
-        <w:lastRenderedPageBreak/>
-        <w:t>Tabel 12 Perbandingan fungsi metode MCDM</w:t>
+        <w:t>Tabel 12 Metode SPK dan perannya pada TravelFit</w:t>
       </w:r>
     </w:p>
     <w:tbl>
@@ -10756,9 +10317,9 @@
         <w:tblLook w:val="04A0" w:firstRow="1" w:lastRow="0" w:firstColumn="1" w:lastColumn="0" w:noHBand="0" w:noVBand="1"/>
       </w:tblPr>
       <w:tblGrid>
-        <w:gridCol w:w="1871"/>
-        <w:gridCol w:w="3798"/>
-        <w:gridCol w:w="2268"/>
+        <w:gridCol w:w="1361"/>
+        <w:gridCol w:w="4025"/>
+        <w:gridCol w:w="2551"/>
       </w:tblGrid>
       <w:tr>
         <w:trPr>
@@ -10768,7 +10329,7 @@
         </w:trPr>
         <w:tc>
           <w:tcPr>
-            <w:tcW w:w="1871" w:type="dxa"/>
+            <w:tcW w:w="1361" w:type="dxa"/>
             <w:shd w:val="clear" w:color="auto" w:fill="E7E7E7"/>
             <w:tcMar>
               <w:top w:w="75" w:type="dxa"/>
@@ -10794,7 +10355,7 @@
         </w:tc>
         <w:tc>
           <w:tcPr>
-            <w:tcW w:w="3798" w:type="dxa"/>
+            <w:tcW w:w="4025" w:type="dxa"/>
             <w:shd w:val="clear" w:color="auto" w:fill="E7E7E7"/>
             <w:tcMar>
               <w:top w:w="75" w:type="dxa"/>
@@ -10814,13 +10375,13 @@
               <w:rPr>
                 <w:b/>
               </w:rPr>
-              <w:t>Pertimbangan dalam proyek</w:t>
-            </w:r>
-          </w:p>
-        </w:tc>
-        <w:tc>
-          <w:tcPr>
-            <w:tcW w:w="2268" w:type="dxa"/>
+              <w:t>Fungsi dalam proyek</w:t>
+            </w:r>
+          </w:p>
+        </w:tc>
+        <w:tc>
+          <w:tcPr>
+            <w:tcW w:w="2551" w:type="dxa"/>
             <w:shd w:val="clear" w:color="auto" w:fill="E7E7E7"/>
             <w:tcMar>
               <w:top w:w="75" w:type="dxa"/>
@@ -10840,7 +10401,7 @@
               <w:rPr>
                 <w:b/>
               </w:rPr>
-              <w:t>Status</w:t>
+              <w:t>Penggunaan</w:t>
             </w:r>
           </w:p>
         </w:tc>
@@ -10852,7 +10413,7 @@
         </w:trPr>
         <w:tc>
           <w:tcPr>
-            <w:tcW w:w="1871" w:type="dxa"/>
+            <w:tcW w:w="1361" w:type="dxa"/>
             <w:shd w:val="clear" w:color="auto" w:fill="FFFFFF"/>
             <w:tcMar>
               <w:top w:w="75" w:type="dxa"/>
@@ -10875,7 +10436,7 @@
         </w:tc>
         <w:tc>
           <w:tcPr>
-            <w:tcW w:w="3798" w:type="dxa"/>
+            <w:tcW w:w="4025" w:type="dxa"/>
             <w:shd w:val="clear" w:color="auto" w:fill="FFFFFF"/>
             <w:tcMar>
               <w:top w:w="75" w:type="dxa"/>
@@ -10898,7 +10459,7 @@
         </w:tc>
         <w:tc>
           <w:tcPr>
-            <w:tcW w:w="2268" w:type="dxa"/>
+            <w:tcW w:w="2551" w:type="dxa"/>
             <w:shd w:val="clear" w:color="auto" w:fill="FFFFFF"/>
             <w:tcMar>
               <w:top w:w="75" w:type="dxa"/>
@@ -10927,7 +10488,7 @@
         </w:trPr>
         <w:tc>
           <w:tcPr>
-            <w:tcW w:w="1871" w:type="dxa"/>
+            <w:tcW w:w="1361" w:type="dxa"/>
             <w:shd w:val="clear" w:color="auto" w:fill="FFFFFF"/>
             <w:tcMar>
               <w:top w:w="75" w:type="dxa"/>
@@ -10950,7 +10511,7 @@
         </w:tc>
         <w:tc>
           <w:tcPr>
-            <w:tcW w:w="3798" w:type="dxa"/>
+            <w:tcW w:w="4025" w:type="dxa"/>
             <w:shd w:val="clear" w:color="auto" w:fill="FFFFFF"/>
             <w:tcMar>
               <w:top w:w="75" w:type="dxa"/>
@@ -10973,7 +10534,7 @@
         </w:tc>
         <w:tc>
           <w:tcPr>
-            <w:tcW w:w="2268" w:type="dxa"/>
+            <w:tcW w:w="2551" w:type="dxa"/>
             <w:shd w:val="clear" w:color="auto" w:fill="FFFFFF"/>
             <w:tcMar>
               <w:top w:w="75" w:type="dxa"/>
@@ -11002,19 +10563,18 @@
         </w:trPr>
         <w:tc>
           <w:tcPr>
-            <w:tcW w:w="1871" w:type="dxa"/>
-            <w:shd w:val="clear" w:color="auto" w:fill="FFFFFF"/>
-            <w:tcMar>
-              <w:top w:w="75" w:type="dxa"/>
-              <w:left w:w="90" w:type="dxa"/>
-              <w:bottom w:w="75" w:type="dxa"/>
-              <w:right w:w="90" w:type="dxa"/>
-            </w:tcMar>
-            <w:vAlign w:val="center"/>
-          </w:tcPr>
-          <w:p>
-            <w:pPr>
-              <w:keepNext/>
+            <w:tcW w:w="1361" w:type="dxa"/>
+            <w:shd w:val="clear" w:color="auto" w:fill="FFFFFF"/>
+            <w:tcMar>
+              <w:top w:w="75" w:type="dxa"/>
+              <w:left w:w="90" w:type="dxa"/>
+              <w:bottom w:w="75" w:type="dxa"/>
+              <w:right w:w="90" w:type="dxa"/>
+            </w:tcMar>
+            <w:vAlign w:val="center"/>
+          </w:tcPr>
+          <w:p>
+            <w:pPr>
               <w:spacing w:after="60"/>
               <w:jc w:val="left"/>
             </w:pPr>
@@ -11025,19 +10585,18 @@
         </w:tc>
         <w:tc>
           <w:tcPr>
-            <w:tcW w:w="3798" w:type="dxa"/>
-            <w:shd w:val="clear" w:color="auto" w:fill="FFFFFF"/>
-            <w:tcMar>
-              <w:top w:w="75" w:type="dxa"/>
-              <w:left w:w="90" w:type="dxa"/>
-              <w:bottom w:w="75" w:type="dxa"/>
-              <w:right w:w="90" w:type="dxa"/>
-            </w:tcMar>
-            <w:vAlign w:val="center"/>
-          </w:tcPr>
-          <w:p>
-            <w:pPr>
-              <w:keepNext/>
+            <w:tcW w:w="4025" w:type="dxa"/>
+            <w:shd w:val="clear" w:color="auto" w:fill="FFFFFF"/>
+            <w:tcMar>
+              <w:top w:w="75" w:type="dxa"/>
+              <w:left w:w="90" w:type="dxa"/>
+              <w:bottom w:w="75" w:type="dxa"/>
+              <w:right w:w="90" w:type="dxa"/>
+            </w:tcMar>
+            <w:vAlign w:val="center"/>
+          </w:tcPr>
+          <w:p>
+            <w:pPr>
               <w:spacing w:after="60"/>
               <w:jc w:val="left"/>
             </w:pPr>
@@ -11048,171 +10607,23 @@
         </w:tc>
         <w:tc>
           <w:tcPr>
-            <w:tcW w:w="2268" w:type="dxa"/>
-            <w:shd w:val="clear" w:color="auto" w:fill="FFFFFF"/>
-            <w:tcMar>
-              <w:top w:w="75" w:type="dxa"/>
-              <w:left w:w="90" w:type="dxa"/>
-              <w:bottom w:w="75" w:type="dxa"/>
-              <w:right w:w="90" w:type="dxa"/>
-            </w:tcMar>
-            <w:vAlign w:val="center"/>
-          </w:tcPr>
-          <w:p>
-            <w:pPr>
-              <w:keepNext/>
+            <w:tcW w:w="2551" w:type="dxa"/>
+            <w:shd w:val="clear" w:color="auto" w:fill="FFFFFF"/>
+            <w:tcMar>
+              <w:top w:w="75" w:type="dxa"/>
+              <w:left w:w="90" w:type="dxa"/>
+              <w:bottom w:w="75" w:type="dxa"/>
+              <w:right w:w="90" w:type="dxa"/>
+            </w:tcMar>
+            <w:vAlign w:val="center"/>
+          </w:tcPr>
+          <w:p>
+            <w:pPr>
               <w:spacing w:after="60"/>
               <w:jc w:val="left"/>
             </w:pPr>
             <w:r>
-              <w:t>Validasi internal</w:t>
-            </w:r>
-          </w:p>
-        </w:tc>
-      </w:tr>
-      <w:tr>
-        <w:trPr>
-          <w:cantSplit/>
-          <w:jc w:val="center"/>
-        </w:trPr>
-        <w:tc>
-          <w:tcPr>
-            <w:tcW w:w="1871" w:type="dxa"/>
-            <w:shd w:val="clear" w:color="auto" w:fill="FFFFFF"/>
-            <w:tcMar>
-              <w:top w:w="75" w:type="dxa"/>
-              <w:left w:w="90" w:type="dxa"/>
-              <w:bottom w:w="75" w:type="dxa"/>
-              <w:right w:w="90" w:type="dxa"/>
-            </w:tcMar>
-            <w:vAlign w:val="center"/>
-          </w:tcPr>
-          <w:p>
-            <w:pPr>
-              <w:keepNext/>
-              <w:spacing w:after="60"/>
-              <w:jc w:val="left"/>
-            </w:pPr>
-            <w:r>
-              <w:t>SMART</w:t>
-            </w:r>
-          </w:p>
-        </w:tc>
-        <w:tc>
-          <w:tcPr>
-            <w:tcW w:w="3798" w:type="dxa"/>
-            <w:shd w:val="clear" w:color="auto" w:fill="FFFFFF"/>
-            <w:tcMar>
-              <w:top w:w="75" w:type="dxa"/>
-              <w:left w:w="90" w:type="dxa"/>
-              <w:bottom w:w="75" w:type="dxa"/>
-              <w:right w:w="90" w:type="dxa"/>
-            </w:tcMar>
-            <w:vAlign w:val="center"/>
-          </w:tcPr>
-          <w:p>
-            <w:pPr>
-              <w:keepNext/>
-              <w:spacing w:after="60"/>
-              <w:jc w:val="left"/>
-            </w:pPr>
-            <w:r>
-              <w:t>Memerlukan rancangan nilai utilitas eksplisit</w:t>
-            </w:r>
-          </w:p>
-        </w:tc>
-        <w:tc>
-          <w:tcPr>
-            <w:tcW w:w="2268" w:type="dxa"/>
-            <w:shd w:val="clear" w:color="auto" w:fill="FFFFFF"/>
-            <w:tcMar>
-              <w:top w:w="75" w:type="dxa"/>
-              <w:left w:w="90" w:type="dxa"/>
-              <w:bottom w:w="75" w:type="dxa"/>
-              <w:right w:w="90" w:type="dxa"/>
-            </w:tcMar>
-            <w:vAlign w:val="center"/>
-          </w:tcPr>
-          <w:p>
-            <w:pPr>
-              <w:keepNext/>
-              <w:spacing w:after="60"/>
-              <w:jc w:val="left"/>
-            </w:pPr>
-            <w:r>
-              <w:t>Belum diterapkan</w:t>
-            </w:r>
-          </w:p>
-        </w:tc>
-      </w:tr>
-      <w:tr>
-        <w:trPr>
-          <w:cantSplit/>
-          <w:jc w:val="center"/>
-        </w:trPr>
-        <w:tc>
-          <w:tcPr>
-            <w:tcW w:w="1871" w:type="dxa"/>
-            <w:shd w:val="clear" w:color="auto" w:fill="FFFFFF"/>
-            <w:tcMar>
-              <w:top w:w="75" w:type="dxa"/>
-              <w:left w:w="90" w:type="dxa"/>
-              <w:bottom w:w="75" w:type="dxa"/>
-              <w:right w:w="90" w:type="dxa"/>
-            </w:tcMar>
-            <w:vAlign w:val="center"/>
-          </w:tcPr>
-          <w:p>
-            <w:pPr>
-              <w:spacing w:after="60"/>
-              <w:jc w:val="left"/>
-            </w:pPr>
-            <w:r>
-              <w:t>PROMETHEE atau ELECTRE</w:t>
-            </w:r>
-          </w:p>
-        </w:tc>
-        <w:tc>
-          <w:tcPr>
-            <w:tcW w:w="3798" w:type="dxa"/>
-            <w:shd w:val="clear" w:color="auto" w:fill="FFFFFF"/>
-            <w:tcMar>
-              <w:top w:w="75" w:type="dxa"/>
-              <w:left w:w="90" w:type="dxa"/>
-              <w:bottom w:w="75" w:type="dxa"/>
-              <w:right w:w="90" w:type="dxa"/>
-            </w:tcMar>
-            <w:vAlign w:val="center"/>
-          </w:tcPr>
-          <w:p>
-            <w:pPr>
-              <w:spacing w:after="60"/>
-              <w:jc w:val="left"/>
-            </w:pPr>
-            <w:r>
-              <w:t>Memerlukan rancangan preferensi atau ambang outranking</w:t>
-            </w:r>
-          </w:p>
-        </w:tc>
-        <w:tc>
-          <w:tcPr>
-            <w:tcW w:w="2268" w:type="dxa"/>
-            <w:shd w:val="clear" w:color="auto" w:fill="FFFFFF"/>
-            <w:tcMar>
-              <w:top w:w="75" w:type="dxa"/>
-              <w:left w:w="90" w:type="dxa"/>
-              <w:bottom w:w="75" w:type="dxa"/>
-              <w:right w:w="90" w:type="dxa"/>
-            </w:tcMar>
-            <w:vAlign w:val="center"/>
-          </w:tcPr>
-          <w:p>
-            <w:pPr>
-              <w:spacing w:after="60"/>
-              <w:jc w:val="left"/>
-            </w:pPr>
-            <w:r>
-              <w:t>Belum diterapkan</w:t>
+              <w:t>Validasi internal, bukan ranking website</w:t>
             </w:r>
           </w:p>
         </w:tc>
@@ -11232,15 +10643,15 @@
       <w:pPr>
         <w:pStyle w:val="Heading2"/>
       </w:pPr>
-      <w:bookmarkStart w:id="19" w:name="_Toc242111091"/>
+      <w:bookmarkStart w:id="19" w:name="_Toc242114658"/>
       <w:r>
-        <w:t>2 10 Rancangan Validasi Data Mining dan Rekomendasi</w:t>
+        <w:t>2 10 Validasi Data Mining dan Rekomendasi</w:t>
       </w:r>
       <w:bookmarkEnd w:id="19"/>
     </w:p>
     <w:p>
       <w:r>
-        <w:t>Validasi data memeriksa jumlah destinasi, keunikan ID, kelengkapan fitur, rentang nilai, sumber yang di-hash, serta konsistensi hasil terhadap transformasi bersama. Validasi model mencoba k 2 sampai 6 dan membandingkan silhouette, inertia, dan ukuran cluster. Uji stabilitas lintas seed dan pembandingan langsung dengan algoritma clustering lain masih dapat dilakukan sebagai pengembangan, bukan hasil yang sudah tersedia dalam laporan model aktif.</w:t>
+        <w:t>Validasi data memeriksa jumlah destinasi, keunikan ID, kelengkapan fitur, rentang nilai, sumber yang di-hash, serta konsistensi hasil terhadap transformasi bersama. Validasi model mencoba k 2 sampai 6 dan membandingkan silhouette, inertia, dan ukuran cluster. Hasil numerik pada Tabel 6 menjadi dasar pemilihan jumlah cluster.</w:t>
       </w:r>
     </w:p>
     <w:p>
@@ -11256,7 +10667,7 @@
       </w:pPr>
       <w:r>
         <w:lastRenderedPageBreak/>
-        <w:t>Tabel 13 Rencana validasi dan bukti yang sudah tersedia</w:t>
+        <w:t>Tabel 13 Validasi dan bukti implementasi</w:t>
       </w:r>
     </w:p>
     <w:tbl>
@@ -11533,6 +10944,7 @@
           </w:tcPr>
           <w:p>
             <w:pPr>
+              <w:keepNext/>
               <w:spacing w:after="60"/>
               <w:jc w:val="left"/>
             </w:pPr>
@@ -11555,6 +10967,7 @@
           </w:tcPr>
           <w:p>
             <w:pPr>
+              <w:keepNext/>
               <w:spacing w:after="60"/>
               <w:jc w:val="left"/>
             </w:pPr>
@@ -11577,6 +10990,7 @@
           </w:tcPr>
           <w:p>
             <w:pPr>
+              <w:keepNext/>
               <w:spacing w:after="60"/>
               <w:jc w:val="left"/>
             </w:pPr>
@@ -11605,6 +11019,7 @@
           </w:tcPr>
           <w:p>
             <w:pPr>
+              <w:keepNext/>
               <w:spacing w:after="60"/>
               <w:jc w:val="left"/>
             </w:pPr>
@@ -11627,6 +11042,7 @@
           </w:tcPr>
           <w:p>
             <w:pPr>
+              <w:keepNext/>
               <w:spacing w:after="60"/>
               <w:jc w:val="left"/>
             </w:pPr>
@@ -11649,6 +11065,7 @@
           </w:tcPr>
           <w:p>
             <w:pPr>
+              <w:keepNext/>
               <w:spacing w:after="60"/>
               <w:jc w:val="left"/>
             </w:pPr>
@@ -11677,6 +11094,7 @@
           </w:tcPr>
           <w:p>
             <w:pPr>
+              <w:keepNext/>
               <w:spacing w:after="60"/>
               <w:jc w:val="left"/>
             </w:pPr>
@@ -11699,6 +11117,7 @@
           </w:tcPr>
           <w:p>
             <w:pPr>
+              <w:keepNext/>
               <w:spacing w:after="60"/>
               <w:jc w:val="left"/>
             </w:pPr>
@@ -11721,6 +11140,7 @@
           </w:tcPr>
           <w:p>
             <w:pPr>
+              <w:keepNext/>
               <w:spacing w:after="60"/>
               <w:jc w:val="left"/>
             </w:pPr>
@@ -11749,6 +11169,7 @@
           </w:tcPr>
           <w:p>
             <w:pPr>
+              <w:keepNext/>
               <w:spacing w:after="60"/>
               <w:jc w:val="left"/>
             </w:pPr>
@@ -11771,6 +11192,7 @@
           </w:tcPr>
           <w:p>
             <w:pPr>
+              <w:keepNext/>
               <w:spacing w:after="60"/>
               <w:jc w:val="left"/>
             </w:pPr>
@@ -11793,6 +11215,7 @@
           </w:tcPr>
           <w:p>
             <w:pPr>
+              <w:keepNext/>
               <w:spacing w:after="60"/>
               <w:jc w:val="left"/>
             </w:pPr>
@@ -11825,7 +11248,7 @@
               <w:jc w:val="left"/>
             </w:pPr>
             <w:r>
-              <w:t>Evaluasi pengguna</w:t>
+              <w:t>Penanda kualitas data</w:t>
             </w:r>
           </w:p>
         </w:tc>
@@ -11847,7 +11270,7 @@
               <w:jc w:val="left"/>
             </w:pPr>
             <w:r>
-              <w:t>Kuesioner relevansi dan kemudahan</w:t>
+              <w:t>Konflik koordinat dan rating kosong</w:t>
             </w:r>
           </w:p>
         </w:tc>
@@ -11869,79 +11292,7 @@
               <w:jc w:val="left"/>
             </w:pPr>
             <w:r>
-              <w:t>Belum ada hasil responden</w:t>
-            </w:r>
-          </w:p>
-        </w:tc>
-      </w:tr>
-      <w:tr>
-        <w:trPr>
-          <w:cantSplit/>
-          <w:jc w:val="center"/>
-        </w:trPr>
-        <w:tc>
-          <w:tcPr>
-            <w:tcW w:w="1814" w:type="dxa"/>
-            <w:shd w:val="clear" w:color="auto" w:fill="FFFFFF"/>
-            <w:tcMar>
-              <w:top w:w="75" w:type="dxa"/>
-              <w:left w:w="90" w:type="dxa"/>
-              <w:bottom w:w="75" w:type="dxa"/>
-              <w:right w:w="90" w:type="dxa"/>
-            </w:tcMar>
-            <w:vAlign w:val="center"/>
-          </w:tcPr>
-          <w:p>
-            <w:pPr>
-              <w:spacing w:after="60"/>
-              <w:jc w:val="left"/>
-            </w:pPr>
-            <w:r>
-              <w:t>Kualitas lapangan</w:t>
-            </w:r>
-          </w:p>
-        </w:tc>
-        <w:tc>
-          <w:tcPr>
-            <w:tcW w:w="3118" w:type="dxa"/>
-            <w:shd w:val="clear" w:color="auto" w:fill="FFFFFF"/>
-            <w:tcMar>
-              <w:top w:w="75" w:type="dxa"/>
-              <w:left w:w="90" w:type="dxa"/>
-              <w:bottom w:w="75" w:type="dxa"/>
-              <w:right w:w="90" w:type="dxa"/>
-            </w:tcMar>
-            <w:vAlign w:val="center"/>
-          </w:tcPr>
-          <w:p>
-            <w:pPr>
-              <w:spacing w:after="60"/>
-              <w:jc w:val="left"/>
-            </w:pPr>
-            <w:r>
-              <w:t>Audit harga paket, koordinat, dan fasilitas</w:t>
-            </w:r>
-          </w:p>
-        </w:tc>
-        <w:tc>
-          <w:tcPr>
-            <w:tcW w:w="3005" w:type="dxa"/>
-            <w:shd w:val="clear" w:color="auto" w:fill="FFFFFF"/>
-            <w:tcMar>
-              <w:top w:w="75" w:type="dxa"/>
-              <w:left w:w="90" w:type="dxa"/>
-              <w:bottom w:w="75" w:type="dxa"/>
-              <w:right w:w="90" w:type="dxa"/>
-            </w:tcMar>
-            <w:vAlign w:val="center"/>
-          </w:tcPr>
-          <w:p>
-            <w:pPr>
-              <w:spacing w:after="60"/>
-              <w:jc w:val="left"/>
-            </w:pPr>
-            <w:r>
-              <w:t>Masih memerlukan review lanjutan</w:t>
+              <w:t>Marina dan Tahura ditandai</w:t>
             </w:r>
           </w:p>
         </w:tc>
@@ -11958,19 +11309,11 @@
       </w:r>
     </w:p>
     <w:p>
-      <w:r>
-        <w:t>Untuk evaluasi lanjutan, responden dapat menilai kesesuaian rekomendasi dengan kebutuhan dan kemudahan membaca alasan hasil. Jika tujuan survei adalah menghasilkan bobot AHP, enam kriteria membutuhkan 15 pasangan perbandingan. Jika survei hanya memakai skala kepentingan 1 sampai 10 per kriteria, hasilnya adalah ukuran kepentingan langsung, bukan matriks AHP otomatis. Accuracy, precision, recall, F1-score, atau precision at k baru dapat dilaporkan setelah target relevansi, sampel evaluasi, dan aturan penilai</w:t>
-      </w:r>
-      <w:r>
-        <w:t>annya ditetapkan.</w:t>
-      </w:r>
-    </w:p>
-    <w:p>
       <w:pPr>
         <w:pStyle w:val="Heading1"/>
         <w:pageBreakBefore/>
       </w:pPr>
-      <w:bookmarkStart w:id="20" w:name="_Toc242111092"/>
+      <w:bookmarkStart w:id="20" w:name="_Toc242114659"/>
       <w:r>
         <w:lastRenderedPageBreak/>
         <w:t>BAB 3 BUKTI PERHITUNGAN DAN PEMAHAMAN MODEL SPK</w:t>
@@ -11981,7 +11324,7 @@
       <w:pPr>
         <w:pStyle w:val="Heading2"/>
       </w:pPr>
-      <w:bookmarkStart w:id="21" w:name="_Toc242111093"/>
+      <w:bookmarkStart w:id="21" w:name="_Toc242114660"/>
       <w:r>
         <w:t>3 1 Berkas Bukti dan README</w:t>
       </w:r>
@@ -12046,14 +11389,14 @@
     </w:p>
     <w:p>
       <w:r>
-        <w:t>Excel aktif berada di folder outputs/excel_spk_20261005. Tautan file menggunakan lokasi relatif terhadap laporan ini; pertahankan susunan folder saat dibagikan. XLSX dan DOCX lama di root adalah arsip. Tautan repository mengikuti versi yang sudah diunggah. Snapshot codebase sebelum perubahan budget: fc4b956 beserta manifest java443-v1. Pembaruan branch dapat mengubah isi tautan tanpa mengubah berkas laporan ini.</w:t>
+        <w:t>Excel aktif berada di folder outputs/excel_spk_20261005. Tautan file menggunakan lokasi relatif terhadap laporan ini; pertahankan susunan folder saat dibagikan. Snapshot codebase laporan adalah commit 93a6a0f dengan manifest java443-v1. Tautan repository mengikuti versi yang sudah diunggah.</w:t>
       </w:r>
     </w:p>
     <w:p>
       <w:pPr>
         <w:pStyle w:val="Heading2"/>
       </w:pPr>
-      <w:bookmarkStart w:id="22" w:name="_Toc242111094"/>
+      <w:bookmarkStart w:id="22" w:name="_Toc242114661"/>
       <w:r>
         <w:t>3 2 Skenario Perhitungan dari Snapshot Aplikasi</w:t>
       </w:r>
@@ -12411,6 +11754,7 @@
     </w:p>
     <w:p>
       <w:r>
+        <w:lastRenderedPageBreak/>
         <w:t>Kedua destinasi mempunyai C4 = 0 pada pipeline deskripsi aktif. Ini menunjukkan tidak adanya penyebutan fasilitas yang diterima, bukan fasilitasnya pasti tidak tersedia. Tahura mempunyai tag edukasi, sedangkan Museum Multatuli mempunyai budaya, edukasi, dan sejarah. Karena hobi tidak dipilih pada skenario, seluruh C6 bernilai 0.</w:t>
       </w:r>
     </w:p>
@@ -12418,7 +11762,7 @@
       <w:pPr>
         <w:pStyle w:val="Heading2"/>
       </w:pPr>
-      <w:bookmarkStart w:id="23" w:name="_Toc242111095"/>
+      <w:bookmarkStart w:id="23" w:name="_Toc242114662"/>
       <w:r>
         <w:t>3 3 Pembuktian Bobot AHP</w:t>
       </w:r>
@@ -14480,7 +13824,7 @@
       <w:pPr>
         <w:pStyle w:val="Heading2"/>
       </w:pPr>
-      <w:bookmarkStart w:id="24" w:name="_Toc242111096"/>
+      <w:bookmarkStart w:id="24" w:name="_Toc242114663"/>
       <w:r>
         <w:t>3 4 Pembuktian Harga Tiket C1</w:t>
       </w:r>
@@ -14862,7 +14206,7 @@
       <w:pPr>
         <w:pStyle w:val="Heading2"/>
       </w:pPr>
-      <w:bookmarkStart w:id="25" w:name="_Toc242111097"/>
+      <w:bookmarkStart w:id="25" w:name="_Toc242114664"/>
       <w:r>
         <w:t>3 5 Matriks Keputusan dan Normalisasi TOPSIS</w:t>
       </w:r>
@@ -16638,7 +15982,7 @@
       <w:pPr>
         <w:pStyle w:val="Heading2"/>
       </w:pPr>
-      <w:bookmarkStart w:id="26" w:name="_Toc242111098"/>
+      <w:bookmarkStart w:id="26" w:name="_Toc242114665"/>
       <w:r>
         <w:t>3 6 Solusi Ideal Jarak dan Ranking</w:t>
       </w:r>
@@ -17771,7 +17115,7 @@
       <w:pPr>
         <w:pStyle w:val="Heading2"/>
       </w:pPr>
-      <w:bookmarkStart w:id="27" w:name="_Toc242111099"/>
+      <w:bookmarkStart w:id="27" w:name="_Toc242114666"/>
       <w:r>
         <w:t>3 7 Pembanding SAW dan Sensitivitas</w:t>
       </w:r>
@@ -18588,14 +17932,14 @@
     </w:p>
     <w:p>
       <w:r>
-        <w:t>Tabel sensitivitas dihitung ulang dari matriks kandidat yang sama dengan empat bobot preset. Hasilnya memperlihatkan dampak prioritas, bukan hasil responden. Untuk validasi yang lebih kuat, pengujian perlu mencakup lebih banyak provinsi, asal kota, budget, dan kasus hobi agar kolom yang pada skenario ini konstan juga mendapat pembanding.</w:t>
+        <w:t>Tabel sensitivitas dihitung ulang dari matriks kandidat Banten yang sama dengan empat bobot preset. Hasilnya memperlihatkan dampak perubahan prioritas pada skenario tersebut. C4 dan C6 bernilai konstan pada kedua kandidat sehingga tidak membedakan peringkat dalam contoh ini.</w:t>
       </w:r>
     </w:p>
     <w:p>
       <w:pPr>
         <w:pStyle w:val="Heading2"/>
       </w:pPr>
-      <w:bookmarkStart w:id="28" w:name="_Toc242111100"/>
+      <w:bookmarkStart w:id="28" w:name="_Toc242114667"/>
       <w:r>
         <w:t>3 8 Reproduksi Perhitungan dan Keterbatasan</w:t>
       </w:r>
@@ -18603,11 +17947,11 @@
     </w:p>
     <w:p>
       <w:r>
-        <w:t xml:space="preserve">Pipeline produksi direproduksi dengan urutan preprocess_destinations, import_destinations, lalu train_clusters. Notebook 01 menggunakan fungsi </w:t>
+        <w:t xml:space="preserve">Pipeline produksi direproduksi dengan urutan preprocess_destinations, import_destinations, lalu train_clusters. Notebook preprocessing menjelaskan pembersihan dan pembentukan fitur. Fungsi bersama pada data_pipeline.py </w:t>
       </w:r>
       <w:r>
         <w:lastRenderedPageBreak/>
-        <w:t>bersama pada data_pipeline.py. Notebook 03 merupakan versi penjelasan cleaning yang lebih rinci dan menghasilkan dua CSV identik pada audit snapshot sekarang, tetapi belum mengekspor manifest dan summary. Di Colab, notebook 03 juga perlu mengarahkan PROJECT_ROOT ke Drive TravelFit. Karena itu, notebook tersebut belum berdiri sendiri sebagai pengganti workflow produksi lengkap.</w:t>
+        <w:t>menjaga konsistensi transformasi, sedangkan manifest dan fingerprint memeriksa kesesuaian data olahan dengan sumber sebelum impor dan pelatihan.</w:t>
       </w:r>
     </w:p>
     <w:p>
@@ -18625,7 +17969,7 @@
         <w:pStyle w:val="Heading1"/>
         <w:pageBreakBefore/>
       </w:pPr>
-      <w:bookmarkStart w:id="29" w:name="_Toc242111101"/>
+      <w:bookmarkStart w:id="29" w:name="_Toc242114668"/>
       <w:r>
         <w:lastRenderedPageBreak/>
         <w:t>BAB 4 LOGBOOK DAN JADWAL KEGIATAN</w:t>
@@ -18636,7 +17980,7 @@
       <w:pPr>
         <w:pStyle w:val="Heading2"/>
       </w:pPr>
-      <w:bookmarkStart w:id="30" w:name="_Toc242111102"/>
+      <w:bookmarkStart w:id="30" w:name="_Toc242114669"/>
       <w:r>
         <w:t>4 1 Logbook Harian</w:t>
       </w:r>
@@ -20831,7 +20175,7 @@
       <w:pPr>
         <w:pStyle w:val="Heading2"/>
       </w:pPr>
-      <w:bookmarkStart w:id="31" w:name="_Toc242111103"/>
+      <w:bookmarkStart w:id="31" w:name="_Toc242114670"/>
       <w:r>
         <w:t>4 2 Jadwal Kegiatan dari Awal sampai Implementasi</w:t>
       </w:r>
@@ -20839,7 +20183,7 @@
     </w:p>
     <w:p>
       <w:r>
-        <w:t>Jadwal berikut menunjukkan rentang rekam kegiatan pada riwayat commit repository dari 1 September sampai 1 Oktober 2026. Rentang bar memperlihatkan tanggal pertama dan terakhir bukti terkait, bukan jam kerja atau bukti bahwa kegiatan dilakukan terus-menerus setiap hari. Aktivitas yang berasal dari pengembangan data lama dicatat sebagai sejarah proyek, sedangkan hasil aktif yang dibahas dalam laporan adalah Java443.</w:t>
+        <w:t>Jadwal berikut menunjukkan rentang rekam kegiatan pada riwayat commit repository dari 1 September sampai 1 Oktober 2026. Rentang bar memperlihatkan tanggal pertama dan terakhir bukti terkait, bukan jam kerja atau bukti bahwa kegiatan dilakukan terus-menerus setiap hari. Tahapan kegiatan mencakup perencanaan, preprocessing, penerapan metode, website, dan integrasi data Java443.</w:t>
       </w:r>
     </w:p>
     <w:p>
@@ -20861,7 +20205,7 @@
           <w:noProof/>
         </w:rPr>
         <w:drawing>
-          <wp:inline distT="0" distB="0" distL="0" distR="0" wp14:anchorId="3923B068" wp14:editId="29335D86">
+          <wp:inline distT="0" distB="0" distL="0" distR="0" wp14:anchorId="5717DF74" wp14:editId="49E440ED">
             <wp:extent cx="5040000" cy="3192000"/>
             <wp:effectExtent l="0" t="0" r="0" b="0"/>
             <wp:docPr id="1" name="Picture 1" descr="Bar chart delapan kegiatan proyek dari 1 September sampai 1 Oktober 2026 berdasarkan riwayat commit"/>
@@ -21446,7 +20790,7 @@
               <w:jc w:val="left"/>
             </w:pPr>
             <w:r>
-              <w:t>Django, AHP, TOPSIS, dan biaya total</w:t>
+              <w:t>Django, AHP, TOPSIS, dan integrasi perhitungan</w:t>
             </w:r>
           </w:p>
         </w:tc>
@@ -21590,7 +20934,7 @@
               <w:jc w:val="left"/>
             </w:pPr>
             <w:r>
-              <w:t>Commit fc4b956 Notebook update</w:t>
+              <w:t>Notebook update pada riwayat repository</w:t>
             </w:r>
           </w:p>
         </w:tc>
@@ -21605,20 +20949,15 @@
       <w:pPr>
         <w:pStyle w:val="Heading2"/>
       </w:pPr>
-      <w:bookmarkStart w:id="32" w:name="_Toc242111104"/>
+      <w:bookmarkStart w:id="32" w:name="_Toc242114671"/>
       <w:r>
-        <w:t>4 3 Status Implementasi dan Kegiatan Lanjutan</w:t>
+        <w:t>4 3 Status Implementasi Project</w:t>
       </w:r>
       <w:bookmarkEnd w:id="32"/>
     </w:p>
     <w:p>
       <w:r>
         <w:t>Implementasi lokal sudah mencakup pengolahan 443 destinasi, pelabelan K-Means, empat profil AHP, TOPSIS, formulir preferensi, batas tiket, dan peta Jawa. Peringkat dipublikasikan bersama rincian yang membantu pembaca melihat penyebab suatu alternatif lebih dekat dengan nilai ideal. Sumber dan catatan kualitas ditampilkan agar hasil tidak terlepas dari kondisi data.</w:t>
-      </w:r>
-    </w:p>
-    <w:p>
-      <w:r>
-        <w:t>Kegiatan lanjutan mencakup audit jenis harga dan komponen paket, verifikasi koordinat yang konflik, penguatan indikator fasilitas, dan pengumpulan tanggapan pengguna. Survei dapat digunakan untuk mengevaluasi relevansi dan kemudahan aplikasi atau untuk merancang bobot baru melalui prosedur yang sesuai. Hasilnya perlu dicatat terpisah dari bobot preset dan hasil model saat ini.</w:t>
       </w:r>
     </w:p>
     <w:p>
@@ -21631,7 +20970,7 @@
         <w:pStyle w:val="Heading1"/>
         <w:pageBreakBefore/>
       </w:pPr>
-      <w:bookmarkStart w:id="33" w:name="_Toc242111105"/>
+      <w:bookmarkStart w:id="33" w:name="_Toc242114672"/>
       <w:r>
         <w:lastRenderedPageBreak/>
         <w:t>DAFTAR PUSTAKA</w:t>
@@ -21675,7 +21014,7 @@
         <w:ind w:left="454" w:hanging="454"/>
       </w:pPr>
       <w:r>
-        <w:t>Kelompok TravelFit (2026a) TravelFit Rekomendasi Destinasi Wisata Jawa dan evaluasi K-Means Java443. Repository proyek, branch new, snapshot commit fc4b956. Tersedia pada: https://github.com/ReBioNC/SPK_Destinasi_Wisata (Diakses: 1 Oktober 2026).</w:t>
+        <w:t>Kelompok TravelFit (2026a) TravelFit Rekomendasi Destinasi Wisata Jawa dan evaluasi K-Means Java443. Repository proyek, branch new, snapshot commit 93a6a0f. Tersedia pada: https://github.com/ReBioNC/SPK_Destinasi_Wisata (Diakses lokal: 5 Oktober 2026).</w:t>
       </w:r>
     </w:p>
     <w:p>
@@ -22040,31 +21379,31 @@
       </w:rPr>
     </w:lvl>
   </w:abstractNum>
-  <w:num w:numId="1" w16cid:durableId="1070619578">
+  <w:num w:numId="1" w16cid:durableId="662053615">
     <w:abstractNumId w:val="8"/>
   </w:num>
-  <w:num w:numId="2" w16cid:durableId="344215994">
+  <w:num w:numId="2" w16cid:durableId="1930776223">
     <w:abstractNumId w:val="6"/>
   </w:num>
-  <w:num w:numId="3" w16cid:durableId="793134352">
+  <w:num w:numId="3" w16cid:durableId="1608346147">
     <w:abstractNumId w:val="5"/>
   </w:num>
-  <w:num w:numId="4" w16cid:durableId="781608569">
+  <w:num w:numId="4" w16cid:durableId="1779254240">
     <w:abstractNumId w:val="4"/>
   </w:num>
-  <w:num w:numId="5" w16cid:durableId="1017120006">
+  <w:num w:numId="5" w16cid:durableId="1456221054">
     <w:abstractNumId w:val="7"/>
   </w:num>
-  <w:num w:numId="6" w16cid:durableId="2140999232">
+  <w:num w:numId="6" w16cid:durableId="750464926">
     <w:abstractNumId w:val="3"/>
   </w:num>
-  <w:num w:numId="7" w16cid:durableId="554704254">
+  <w:num w:numId="7" w16cid:durableId="1287272052">
     <w:abstractNumId w:val="2"/>
   </w:num>
-  <w:num w:numId="8" w16cid:durableId="852652143">
+  <w:num w:numId="8" w16cid:durableId="296373087">
     <w:abstractNumId w:val="1"/>
   </w:num>
-  <w:num w:numId="9" w16cid:durableId="1495032525">
+  <w:num w:numId="9" w16cid:durableId="1052076247">
     <w:abstractNumId w:val="0"/>
   </w:num>
 </w:numbering>
@@ -33776,7 +33115,7 @@
     <w:autoRedefine/>
     <w:uiPriority w:val="39"/>
     <w:unhideWhenUsed/>
-    <w:rsid w:val="0078763B"/>
+    <w:rsid w:val="00D02E3F"/>
     <w:pPr>
       <w:spacing w:after="100"/>
     </w:pPr>
@@ -33788,7 +33127,7 @@
     <w:autoRedefine/>
     <w:uiPriority w:val="39"/>
     <w:unhideWhenUsed/>
-    <w:rsid w:val="0078763B"/>
+    <w:rsid w:val="00D02E3F"/>
     <w:pPr>
       <w:spacing w:after="100"/>
       <w:ind w:left="240"/>
@@ -33799,7 +33138,7 @@
     <w:basedOn w:val="DefaultParagraphFont"/>
     <w:uiPriority w:val="99"/>
     <w:unhideWhenUsed/>
-    <w:rsid w:val="0078763B"/>
+    <w:rsid w:val="00D02E3F"/>
     <w:rPr>
       <w:color w:val="0000FF" w:themeColor="hyperlink"/>
       <w:u w:val="single"/>

</xml_diff>